<commit_message>
Add live demo and GitHub repository links to README and article generation script
</commit_message>
<xml_diff>
--- a/Ear_Landmarker_Article.docx
+++ b/Ear_Landmarker_Article.docx
@@ -12,6 +12,40 @@
         </w:rPr>
         <w:t>Real-Time 55-Point Ear Landmark Detection: A BlazeBlock Pipeline from Data Curation to Browser Deployment</w:t>
       </w:r>
+    </w:p>
+    <w:p>
+      <w:r>
+        <w:rPr>
+          <w:sz w:val="22"/>
+        </w:rPr>
+        <w:t xml:space="preserve">Try the </w:t>
+      </w:r>
+      <w:hyperlink r:id="rId9">
+        <w:r>
+          <w:rPr>
+            <w:color w:val="0563C1"/>
+            <w:u w:val="single"/>
+            <w:sz w:val="22"/>
+          </w:rPr>
+          <w:t>live browser demo</w:t>
+        </w:r>
+      </w:hyperlink>
+      <w:r>
+        <w:rPr>
+          <w:sz w:val="22"/>
+        </w:rPr>
+        <w:t xml:space="preserve"> | </w:t>
+      </w:r>
+      <w:hyperlink r:id="rId10">
+        <w:r>
+          <w:rPr>
+            <w:color w:val="0563C1"/>
+            <w:u w:val="single"/>
+            <w:sz w:val="22"/>
+          </w:rPr>
+          <w:t>GitHub repository</w:t>
+        </w:r>
+      </w:hyperlink>
     </w:p>
     <w:p>
       <w:pPr>
@@ -51,7 +85,7 @@
         </w:rPr>
         <w:t xml:space="preserve">This is the third project in a series. The first, </w:t>
       </w:r>
-      <w:hyperlink r:id="rId9">
+      <w:hyperlink r:id="rId11">
         <w:r>
           <w:rPr>
             <w:color w:val="0563C1"/>
@@ -67,7 +101,7 @@
         </w:rPr>
         <w:t xml:space="preserve">, rebuilt MediaPipe's face detector as a fully trainable PyTorch model with browser deployment. The second, </w:t>
       </w:r>
-      <w:hyperlink r:id="rId10">
+      <w:hyperlink r:id="rId12">
         <w:r>
           <w:rPr>
             <w:color w:val="0563C1"/>
@@ -590,7 +624,7 @@
         </w:rPr>
         <w:t xml:space="preserve">The system uses a two-stage pipeline at inference time. A </w:t>
       </w:r>
-      <w:hyperlink r:id="rId10">
+      <w:hyperlink r:id="rId12">
         <w:r>
           <w:rPr>
             <w:color w:val="0563C1"/>
@@ -1201,7 +1235,7 @@
         </w:rPr>
         <w:t xml:space="preserve">Each BlazeBlock is a depthwise separable convolution with a skip connection: DepthwiseConv (5x5) -&gt; BatchNorm -&gt; PointwiseConv (1x1) -&gt; BatchNorm -&gt; Add -&gt; ReLU. Stride-2 blocks use max pooling on the skip path. When input and output channels differ, the skip connection includes a learned 1x1 projection. This is the same block used in </w:t>
       </w:r>
-      <w:hyperlink r:id="rId9">
+      <w:hyperlink r:id="rId11">
         <w:r>
           <w:rPr>
             <w:color w:val="0563C1"/>
@@ -1217,7 +1251,7 @@
         </w:rPr>
         <w:t xml:space="preserve"> and </w:t>
       </w:r>
-      <w:hyperlink r:id="rId10">
+      <w:hyperlink r:id="rId12">
         <w:r>
           <w:rPr>
             <w:color w:val="0563C1"/>
@@ -1261,7 +1295,7 @@
         </w:rPr>
         <w:t xml:space="preserve">The initial conv0 layer and early BlazeBlocks share the same channel dimensions as the </w:t>
       </w:r>
-      <w:hyperlink r:id="rId10">
+      <w:hyperlink r:id="rId12">
         <w:r>
           <w:rPr>
             <w:color w:val="0563C1"/>
@@ -2280,7 +2314,7 @@
         </w:rPr>
         <w:t xml:space="preserve">The browser demo provides webcam and image upload modes with real-time visualization of bounding boxes and color-coded linestrip landmarks. This follows the same deployment pattern used for the </w:t>
       </w:r>
-      <w:hyperlink r:id="rId10">
+      <w:hyperlink r:id="rId12">
         <w:r>
           <w:rPr>
             <w:color w:val="0563C1"/>
@@ -2296,7 +2330,7 @@
         </w:rPr>
         <w:t xml:space="preserve"> and </w:t>
       </w:r>
-      <w:hyperlink r:id="rId9">
+      <w:hyperlink r:id="rId11">
         <w:r>
           <w:rPr>
             <w:color w:val="0563C1"/>
@@ -2310,7 +2344,39 @@
         <w:rPr>
           <w:sz w:val="22"/>
         </w:rPr>
-        <w:t xml:space="preserve"> browser demos. No server-side computation is required. The full demo is a static site deployable via GitHub Pages: one HTML file, one JavaScript module, and two ONNX model files.</w:t>
+        <w:t xml:space="preserve"> browser demos. No server-side computation is required. The full demo is a static site deployable via GitHub Pages: one HTML file, one JavaScript module, and two ONNX model files. </w:t>
+      </w:r>
+      <w:hyperlink r:id="rId9">
+        <w:r>
+          <w:rPr>
+            <w:color w:val="0563C1"/>
+            <w:u w:val="single"/>
+            <w:sz w:val="22"/>
+          </w:rPr>
+          <w:t>Try it here</w:t>
+        </w:r>
+      </w:hyperlink>
+      <w:r>
+        <w:rPr>
+          <w:sz w:val="22"/>
+        </w:rPr>
+        <w:t xml:space="preserve">. Full source code is on </w:t>
+      </w:r>
+      <w:hyperlink r:id="rId10">
+        <w:r>
+          <w:rPr>
+            <w:color w:val="0563C1"/>
+            <w:u w:val="single"/>
+            <w:sz w:val="22"/>
+          </w:rPr>
+          <w:t>GitHub</w:t>
+        </w:r>
+      </w:hyperlink>
+      <w:r>
+        <w:rPr>
+          <w:sz w:val="22"/>
+        </w:rPr>
+        <w:t>.</w:t>
       </w:r>
     </w:p>
     <w:p>
@@ -2543,7 +2609,7 @@
         </w:rPr>
         <w:t xml:space="preserve">In a previous project, </w:t>
       </w:r>
-      <w:hyperlink r:id="rId11">
+      <w:hyperlink r:id="rId13">
         <w:r>
           <w:rPr>
             <w:color w:val="0563C1"/>
@@ -2679,7 +2745,7 @@
         </w:rPr>
         <w:t xml:space="preserve">1. </w:t>
       </w:r>
-      <w:hyperlink r:id="rId9">
+      <w:hyperlink r:id="rId11">
         <w:r>
           <w:rPr>
             <w:color w:val="0563C1"/>
@@ -2703,7 +2769,7 @@
         </w:rPr>
         <w:t xml:space="preserve">2. </w:t>
       </w:r>
-      <w:hyperlink r:id="rId10">
+      <w:hyperlink r:id="rId12">
         <w:r>
           <w:rPr>
             <w:color w:val="0563C1"/>
@@ -2727,7 +2793,7 @@
         </w:rPr>
         <w:t xml:space="preserve">3. </w:t>
       </w:r>
-      <w:hyperlink r:id="rId11">
+      <w:hyperlink r:id="rId13">
         <w:r>
           <w:rPr>
             <w:color w:val="0563C1"/>

</xml_diff>

<commit_message>
Refactor article generation to render tables as ASCII text for improved readability and copy-pasting; add new image asset.
</commit_message>
<xml_diff>
--- a/Ear_Landmarker_Article.docx
+++ b/Ear_Landmarker_Article.docx
@@ -200,361 +200,81 @@
         <w:t>I assembled four publicly available ear landmark datasets spanning three annotation formats:</w:t>
       </w:r>
     </w:p>
-    <w:tbl>
-      <w:tblPr>
-        <w:tblStyle w:val="TableGrid"/>
-        <w:tblW w:type="auto" w:w="0"/>
-        <w:jc w:val="center"/>
-        <w:tblLook w:firstColumn="1" w:firstRow="1" w:lastColumn="0" w:lastRow="0" w:noHBand="0" w:noVBand="1" w:val="04A0"/>
-      </w:tblPr>
-      <w:tblGrid>
-        <w:gridCol w:w="1728"/>
-        <w:gridCol w:w="1728"/>
-        <w:gridCol w:w="1728"/>
-        <w:gridCol w:w="1728"/>
-        <w:gridCol w:w="1728"/>
-      </w:tblGrid>
-      <w:tr>
-        <w:tc>
-          <w:tcPr>
-            <w:tcW w:type="dxa" w:w="1728"/>
-          </w:tcPr>
-          <w:p>
-            <w:r>
-              <w:rPr>
-                <w:b/>
-                <w:sz w:val="20"/>
-              </w:rPr>
-              <w:t>Source</w:t>
-            </w:r>
-          </w:p>
-        </w:tc>
-        <w:tc>
-          <w:tcPr>
-            <w:tcW w:type="dxa" w:w="1728"/>
-          </w:tcPr>
-          <w:p>
-            <w:r>
-              <w:rPr>
-                <w:b/>
-                <w:sz w:val="20"/>
-              </w:rPr>
-              <w:t>Samples</w:t>
-            </w:r>
-          </w:p>
-        </w:tc>
-        <w:tc>
-          <w:tcPr>
-            <w:tcW w:type="dxa" w:w="1728"/>
-          </w:tcPr>
-          <w:p>
-            <w:r>
-              <w:rPr>
-                <w:b/>
-                <w:sz w:val="20"/>
-              </w:rPr>
-              <w:t>Format</w:t>
-            </w:r>
-          </w:p>
-        </w:tc>
-        <w:tc>
-          <w:tcPr>
-            <w:tcW w:type="dxa" w:w="1728"/>
-          </w:tcPr>
-          <w:p>
-            <w:r>
-              <w:rPr>
-                <w:b/>
-                <w:sz w:val="20"/>
-              </w:rPr>
-              <w:t>Resolution</w:t>
-            </w:r>
-          </w:p>
-        </w:tc>
-        <w:tc>
-          <w:tcPr>
-            <w:tcW w:type="dxa" w:w="1728"/>
-          </w:tcPr>
-          <w:p>
-            <w:r>
-              <w:rPr>
-                <w:b/>
-                <w:sz w:val="20"/>
-              </w:rPr>
-              <w:t>Notes</w:t>
-            </w:r>
-          </w:p>
-        </w:tc>
-      </w:tr>
-      <w:tr>
-        <w:tc>
-          <w:tcPr>
-            <w:tcW w:type="dxa" w:w="1728"/>
-          </w:tcPr>
-          <w:p>
-            <w:r>
-              <w:rPr>
-                <w:sz w:val="20"/>
-              </w:rPr>
-              <w:t>Collection B</w:t>
-            </w:r>
-          </w:p>
-        </w:tc>
-        <w:tc>
-          <w:tcPr>
-            <w:tcW w:type="dxa" w:w="1728"/>
-          </w:tcPr>
-          <w:p>
-            <w:r>
-              <w:rPr>
-                <w:sz w:val="20"/>
-              </w:rPr>
-              <w:t>3,153</w:t>
-            </w:r>
-          </w:p>
-        </w:tc>
-        <w:tc>
-          <w:tcPr>
-            <w:tcW w:type="dxa" w:w="1728"/>
-          </w:tcPr>
-          <w:p>
-            <w:r>
-              <w:rPr>
-                <w:sz w:val="20"/>
-              </w:rPr>
-              <w:t>.pts (55-point)</w:t>
-            </w:r>
-          </w:p>
-        </w:tc>
-        <w:tc>
-          <w:tcPr>
-            <w:tcW w:type="dxa" w:w="1728"/>
-          </w:tcPr>
-          <w:p>
-            <w:r>
-              <w:rPr>
-                <w:sz w:val="20"/>
-              </w:rPr>
-              <w:t>256x256</w:t>
-            </w:r>
-          </w:p>
-        </w:tc>
-        <w:tc>
-          <w:tcPr>
-            <w:tcW w:type="dxa" w:w="1728"/>
-          </w:tcPr>
-          <w:p>
-            <w:r>
-              <w:rPr>
-                <w:sz w:val="20"/>
-              </w:rPr>
-              <w:t>Pre-cropped ear images</w:t>
-            </w:r>
-          </w:p>
-        </w:tc>
-      </w:tr>
-      <w:tr>
-        <w:tc>
-          <w:tcPr>
-            <w:tcW w:type="dxa" w:w="1728"/>
-          </w:tcPr>
-          <w:p>
-            <w:r>
-              <w:rPr>
-                <w:sz w:val="20"/>
-              </w:rPr>
-              <w:t>AudioEar2D</w:t>
-            </w:r>
-          </w:p>
-        </w:tc>
-        <w:tc>
-          <w:tcPr>
-            <w:tcW w:type="dxa" w:w="1728"/>
-          </w:tcPr>
-          <w:p>
-            <w:r>
-              <w:rPr>
-                <w:sz w:val="20"/>
-              </w:rPr>
-              <w:t>2,000</w:t>
-            </w:r>
-          </w:p>
-        </w:tc>
-        <w:tc>
-          <w:tcPr>
-            <w:tcW w:type="dxa" w:w="1728"/>
-          </w:tcPr>
-          <w:p>
-            <w:r>
-              <w:rPr>
-                <w:sz w:val="20"/>
-              </w:rPr>
-              <w:t>LabelMe JSON</w:t>
-            </w:r>
-          </w:p>
-        </w:tc>
-        <w:tc>
-          <w:tcPr>
-            <w:tcW w:type="dxa" w:w="1728"/>
-          </w:tcPr>
-          <w:p>
-            <w:r>
-              <w:rPr>
-                <w:sz w:val="20"/>
-              </w:rPr>
-              <w:t>299x299</w:t>
-            </w:r>
-          </w:p>
-        </w:tc>
-        <w:tc>
-          <w:tcPr>
-            <w:tcW w:type="dxa" w:w="1728"/>
-          </w:tcPr>
-          <w:p>
-            <w:r>
-              <w:rPr>
-                <w:sz w:val="20"/>
-              </w:rPr>
-              <w:t>Synthetic ears from FFHQ, StyleGAN-generated</w:t>
-            </w:r>
-          </w:p>
-        </w:tc>
-      </w:tr>
-      <w:tr>
-        <w:tc>
-          <w:tcPr>
-            <w:tcW w:type="dxa" w:w="1728"/>
-          </w:tcPr>
-          <w:p>
-            <w:r>
-              <w:rPr>
-                <w:sz w:val="20"/>
-              </w:rPr>
-              <w:t>Collection A</w:t>
-            </w:r>
-          </w:p>
-        </w:tc>
-        <w:tc>
-          <w:tcPr>
-            <w:tcW w:type="dxa" w:w="1728"/>
-          </w:tcPr>
-          <w:p>
-            <w:r>
-              <w:rPr>
-                <w:sz w:val="20"/>
-              </w:rPr>
-              <w:t>605</w:t>
-            </w:r>
-          </w:p>
-        </w:tc>
-        <w:tc>
-          <w:tcPr>
-            <w:tcW w:type="dxa" w:w="1728"/>
-          </w:tcPr>
-          <w:p>
-            <w:r>
-              <w:rPr>
-                <w:sz w:val="20"/>
-              </w:rPr>
-              <w:t>.pts (55-point)</w:t>
-            </w:r>
-          </w:p>
-        </w:tc>
-        <w:tc>
-          <w:tcPr>
-            <w:tcW w:type="dxa" w:w="1728"/>
-          </w:tcPr>
-          <w:p>
-            <w:r>
-              <w:rPr>
-                <w:sz w:val="20"/>
-              </w:rPr>
-              <w:t>Variable</w:t>
-            </w:r>
-          </w:p>
-        </w:tc>
-        <w:tc>
-          <w:tcPr>
-            <w:tcW w:type="dxa" w:w="1728"/>
-          </w:tcPr>
-          <w:p>
-            <w:r>
-              <w:rPr>
-                <w:sz w:val="20"/>
-              </w:rPr>
-              <w:t>Full-face images, auto-cropped to ear ROI</w:t>
-            </w:r>
-          </w:p>
-        </w:tc>
-      </w:tr>
-      <w:tr>
-        <w:tc>
-          <w:tcPr>
-            <w:tcW w:type="dxa" w:w="1728"/>
-          </w:tcPr>
-          <w:p>
-            <w:r>
-              <w:rPr>
-                <w:sz w:val="20"/>
-              </w:rPr>
-              <w:t>AudioEar3D</w:t>
-            </w:r>
-          </w:p>
-        </w:tc>
-        <w:tc>
-          <w:tcPr>
-            <w:tcW w:type="dxa" w:w="1728"/>
-          </w:tcPr>
-          <w:p>
-            <w:r>
-              <w:rPr>
-                <w:sz w:val="20"/>
-              </w:rPr>
-              <w:t>112</w:t>
-            </w:r>
-          </w:p>
-        </w:tc>
-        <w:tc>
-          <w:tcPr>
-            <w:tcW w:type="dxa" w:w="1728"/>
-          </w:tcPr>
-          <w:p>
-            <w:r>
-              <w:rPr>
-                <w:sz w:val="20"/>
-              </w:rPr>
-              <w:t>LabelMe JSON</w:t>
-            </w:r>
-          </w:p>
-        </w:tc>
-        <w:tc>
-          <w:tcPr>
-            <w:tcW w:type="dxa" w:w="1728"/>
-          </w:tcPr>
-          <w:p>
-            <w:r>
-              <w:rPr>
-                <w:sz w:val="20"/>
-              </w:rPr>
-              <w:t>187x186</w:t>
-            </w:r>
-          </w:p>
-        </w:tc>
-        <w:tc>
-          <w:tcPr>
-            <w:tcW w:type="dxa" w:w="1728"/>
-          </w:tcPr>
-          <w:p>
-            <w:r>
-              <w:rPr>
-                <w:sz w:val="20"/>
-              </w:rPr>
-              <w:t>3D-scanned ear renders</w:t>
-            </w:r>
-          </w:p>
-        </w:tc>
-      </w:tr>
-    </w:tbl>
+    <w:p>
+      <w:r>
+        <w:rPr>
+          <w:rFonts w:ascii="Courier New" w:hAnsi="Courier New"/>
+          <w:b/>
+          <w:sz w:val="18"/>
+        </w:rPr>
+        <w:t xml:space="preserve">  Source        |  Samples  |  Format           |  Resolution  |  Notes                                       </w:t>
+      </w:r>
+      <w:r>
+        <w:rPr>
+          <w:sz w:val="18"/>
+        </w:rPr>
+        <w:br/>
+      </w:r>
+      <w:r>
+        <w:rPr>
+          <w:rFonts w:ascii="Courier New" w:hAnsi="Courier New"/>
+          <w:sz w:val="18"/>
+        </w:rPr>
+        <w:t xml:space="preserve">  --------------+-----------+-------------------+--------------+----------------------------------------------</w:t>
+      </w:r>
+      <w:r>
+        <w:rPr>
+          <w:sz w:val="18"/>
+        </w:rPr>
+        <w:br/>
+      </w:r>
+      <w:r>
+        <w:rPr>
+          <w:rFonts w:ascii="Courier New" w:hAnsi="Courier New"/>
+          <w:sz w:val="18"/>
+        </w:rPr>
+        <w:t xml:space="preserve">  Collection B  |  3,153    |  .pts (55-point)  |  256x256     |  Pre-cropped ear images                      </w:t>
+      </w:r>
+      <w:r>
+        <w:rPr>
+          <w:sz w:val="18"/>
+        </w:rPr>
+        <w:br/>
+      </w:r>
+      <w:r>
+        <w:rPr>
+          <w:rFonts w:ascii="Courier New" w:hAnsi="Courier New"/>
+          <w:sz w:val="18"/>
+        </w:rPr>
+        <w:t xml:space="preserve">  AudioEar2D    |  2,000    |  LabelMe JSON     |  299x299     |  Synthetic ears from FFHQ, StyleGAN-generated</w:t>
+      </w:r>
+      <w:r>
+        <w:rPr>
+          <w:sz w:val="18"/>
+        </w:rPr>
+        <w:br/>
+      </w:r>
+      <w:r>
+        <w:rPr>
+          <w:rFonts w:ascii="Courier New" w:hAnsi="Courier New"/>
+          <w:sz w:val="18"/>
+        </w:rPr>
+        <w:t xml:space="preserve">  Collection A  |  605      |  .pts (55-point)  |  Variable    |  Full-face images, auto-cropped to ear ROI   </w:t>
+      </w:r>
+      <w:r>
+        <w:rPr>
+          <w:sz w:val="18"/>
+        </w:rPr>
+        <w:br/>
+      </w:r>
+      <w:r>
+        <w:rPr>
+          <w:rFonts w:ascii="Courier New" w:hAnsi="Courier New"/>
+          <w:sz w:val="18"/>
+        </w:rPr>
+        <w:t xml:space="preserve">  AudioEar3D    |  112      |  LabelMe JSON     |  187x186     |  3D-scanned ear renders                      </w:t>
+      </w:r>
+    </w:p>
     <w:p/>
     <w:p>
       <w:r>
@@ -661,562 +381,120 @@
         <w:t>The architecture follows the MediaPipe FaceMesh pattern: a BlazeBlock backbone with progressive channel expansion, followed by global average pooling and a fully connected regression head with sigmoid activation. The output is 110 values (55 landmarks x 2 coordinates), each in [0, 1], representing normalized positions within the 192x192 crop.</w:t>
       </w:r>
     </w:p>
-    <w:tbl>
-      <w:tblPr>
-        <w:tblStyle w:val="TableGrid"/>
-        <w:tblW w:type="auto" w:w="0"/>
-        <w:jc w:val="center"/>
-        <w:tblLook w:firstColumn="1" w:firstRow="1" w:lastColumn="0" w:lastRow="0" w:noHBand="0" w:noVBand="1" w:val="04A0"/>
-      </w:tblPr>
-      <w:tblGrid>
-        <w:gridCol w:w="1728"/>
-        <w:gridCol w:w="1728"/>
-        <w:gridCol w:w="1728"/>
-        <w:gridCol w:w="1728"/>
-        <w:gridCol w:w="1728"/>
-      </w:tblGrid>
-      <w:tr>
-        <w:tc>
-          <w:tcPr>
-            <w:tcW w:type="dxa" w:w="1728"/>
-          </w:tcPr>
-          <w:p>
-            <w:r>
-              <w:rPr>
-                <w:b/>
-                <w:sz w:val="20"/>
-              </w:rPr>
-              <w:t>Stage</w:t>
-            </w:r>
-          </w:p>
-        </w:tc>
-        <w:tc>
-          <w:tcPr>
-            <w:tcW w:type="dxa" w:w="1728"/>
-          </w:tcPr>
-          <w:p>
-            <w:r>
-              <w:rPr>
-                <w:b/>
-                <w:sz w:val="20"/>
-              </w:rPr>
-              <w:t>Channels</w:t>
-            </w:r>
-          </w:p>
-        </w:tc>
-        <w:tc>
-          <w:tcPr>
-            <w:tcW w:type="dxa" w:w="1728"/>
-          </w:tcPr>
-          <w:p>
-            <w:r>
-              <w:rPr>
-                <w:b/>
-                <w:sz w:val="20"/>
-              </w:rPr>
-              <w:t>Spatial</w:t>
-            </w:r>
-          </w:p>
-        </w:tc>
-        <w:tc>
-          <w:tcPr>
-            <w:tcW w:type="dxa" w:w="1728"/>
-          </w:tcPr>
-          <w:p>
-            <w:r>
-              <w:rPr>
-                <w:b/>
-                <w:sz w:val="20"/>
-              </w:rPr>
-              <w:t>Blocks</w:t>
-            </w:r>
-          </w:p>
-        </w:tc>
-        <w:tc>
-          <w:tcPr>
-            <w:tcW w:type="dxa" w:w="1728"/>
-          </w:tcPr>
-          <w:p>
-            <w:r>
-              <w:rPr>
-                <w:b/>
-                <w:sz w:val="20"/>
-              </w:rPr>
-              <w:t>Parameters</w:t>
-            </w:r>
-          </w:p>
-        </w:tc>
-      </w:tr>
-      <w:tr>
-        <w:tc>
-          <w:tcPr>
-            <w:tcW w:type="dxa" w:w="1728"/>
-          </w:tcPr>
-          <w:p>
-            <w:r>
-              <w:rPr>
-                <w:sz w:val="20"/>
-              </w:rPr>
-              <w:t>conv0</w:t>
-            </w:r>
-          </w:p>
-        </w:tc>
-        <w:tc>
-          <w:tcPr>
-            <w:tcW w:type="dxa" w:w="1728"/>
-          </w:tcPr>
-          <w:p>
-            <w:r>
-              <w:rPr>
-                <w:sz w:val="20"/>
-              </w:rPr>
-              <w:t>3 -&gt; 24</w:t>
-            </w:r>
-          </w:p>
-        </w:tc>
-        <w:tc>
-          <w:tcPr>
-            <w:tcW w:type="dxa" w:w="1728"/>
-          </w:tcPr>
-          <w:p>
-            <w:r>
-              <w:rPr>
-                <w:sz w:val="20"/>
-              </w:rPr>
-              <w:t>192 -&gt; 96</w:t>
-            </w:r>
-          </w:p>
-        </w:tc>
-        <w:tc>
-          <w:tcPr>
-            <w:tcW w:type="dxa" w:w="1728"/>
-          </w:tcPr>
-          <w:p>
-            <w:r>
-              <w:rPr>
-                <w:sz w:val="20"/>
-              </w:rPr>
-              <w:t>1 (Conv 5x5 s=2)</w:t>
-            </w:r>
-          </w:p>
-        </w:tc>
-        <w:tc>
-          <w:tcPr>
-            <w:tcW w:type="dxa" w:w="1728"/>
-          </w:tcPr>
-          <w:p>
-            <w:r>
-              <w:rPr>
-                <w:sz w:val="20"/>
-              </w:rPr>
-              <w:t>1,848</w:t>
-            </w:r>
-          </w:p>
-        </w:tc>
-      </w:tr>
-      <w:tr>
-        <w:tc>
-          <w:tcPr>
-            <w:tcW w:type="dxa" w:w="1728"/>
-          </w:tcPr>
-          <w:p>
-            <w:r>
-              <w:rPr>
-                <w:sz w:val="20"/>
-              </w:rPr>
-              <w:t>stage0</w:t>
-            </w:r>
-          </w:p>
-        </w:tc>
-        <w:tc>
-          <w:tcPr>
-            <w:tcW w:type="dxa" w:w="1728"/>
-          </w:tcPr>
-          <w:p>
-            <w:r>
-              <w:rPr>
-                <w:sz w:val="20"/>
-              </w:rPr>
-              <w:t>24 -&gt; 24</w:t>
-            </w:r>
-          </w:p>
-        </w:tc>
-        <w:tc>
-          <w:tcPr>
-            <w:tcW w:type="dxa" w:w="1728"/>
-          </w:tcPr>
-          <w:p>
-            <w:r>
-              <w:rPr>
-                <w:sz w:val="20"/>
-              </w:rPr>
-              <w:t>96 (no downsample)</w:t>
-            </w:r>
-          </w:p>
-        </w:tc>
-        <w:tc>
-          <w:tcPr>
-            <w:tcW w:type="dxa" w:w="1728"/>
-          </w:tcPr>
-          <w:p>
-            <w:r>
-              <w:rPr>
-                <w:sz w:val="20"/>
-              </w:rPr>
-              <w:t>2 BlazeBlocks</w:t>
-            </w:r>
-          </w:p>
-        </w:tc>
-        <w:tc>
-          <w:tcPr>
-            <w:tcW w:type="dxa" w:w="1728"/>
-          </w:tcPr>
-          <w:p>
-            <w:r>
-              <w:rPr>
-                <w:sz w:val="20"/>
-              </w:rPr>
-              <w:t>2,544</w:t>
-            </w:r>
-          </w:p>
-        </w:tc>
-      </w:tr>
-      <w:tr>
-        <w:tc>
-          <w:tcPr>
-            <w:tcW w:type="dxa" w:w="1728"/>
-          </w:tcPr>
-          <w:p>
-            <w:r>
-              <w:rPr>
-                <w:sz w:val="20"/>
-              </w:rPr>
-              <w:t>stage1</w:t>
-            </w:r>
-          </w:p>
-        </w:tc>
-        <w:tc>
-          <w:tcPr>
-            <w:tcW w:type="dxa" w:w="1728"/>
-          </w:tcPr>
-          <w:p>
-            <w:r>
-              <w:rPr>
-                <w:sz w:val="20"/>
-              </w:rPr>
-              <w:t>24 -&gt; 48</w:t>
-            </w:r>
-          </w:p>
-        </w:tc>
-        <w:tc>
-          <w:tcPr>
-            <w:tcW w:type="dxa" w:w="1728"/>
-          </w:tcPr>
-          <w:p>
-            <w:r>
-              <w:rPr>
-                <w:sz w:val="20"/>
-              </w:rPr>
-              <w:t>96 -&gt; 48</w:t>
-            </w:r>
-          </w:p>
-        </w:tc>
-        <w:tc>
-          <w:tcPr>
-            <w:tcW w:type="dxa" w:w="1728"/>
-          </w:tcPr>
-          <w:p>
-            <w:r>
-              <w:rPr>
-                <w:sz w:val="20"/>
-              </w:rPr>
-              <w:t>4 BlazeBlocks</w:t>
-            </w:r>
-          </w:p>
-        </w:tc>
-        <w:tc>
-          <w:tcPr>
-            <w:tcW w:type="dxa" w:w="1728"/>
-          </w:tcPr>
-          <w:p>
-            <w:r>
-              <w:rPr>
-                <w:sz w:val="20"/>
-              </w:rPr>
-              <w:t>14,232</w:t>
-            </w:r>
-          </w:p>
-        </w:tc>
-      </w:tr>
-      <w:tr>
-        <w:tc>
-          <w:tcPr>
-            <w:tcW w:type="dxa" w:w="1728"/>
-          </w:tcPr>
-          <w:p>
-            <w:r>
-              <w:rPr>
-                <w:sz w:val="20"/>
-              </w:rPr>
-              <w:t>stage2</w:t>
-            </w:r>
-          </w:p>
-        </w:tc>
-        <w:tc>
-          <w:tcPr>
-            <w:tcW w:type="dxa" w:w="1728"/>
-          </w:tcPr>
-          <w:p>
-            <w:r>
-              <w:rPr>
-                <w:sz w:val="20"/>
-              </w:rPr>
-              <w:t>48 -&gt; 96</w:t>
-            </w:r>
-          </w:p>
-        </w:tc>
-        <w:tc>
-          <w:tcPr>
-            <w:tcW w:type="dxa" w:w="1728"/>
-          </w:tcPr>
-          <w:p>
-            <w:r>
-              <w:rPr>
-                <w:sz w:val="20"/>
-              </w:rPr>
-              <w:t>48 -&gt; 24</w:t>
-            </w:r>
-          </w:p>
-        </w:tc>
-        <w:tc>
-          <w:tcPr>
-            <w:tcW w:type="dxa" w:w="1728"/>
-          </w:tcPr>
-          <w:p>
-            <w:r>
-              <w:rPr>
-                <w:sz w:val="20"/>
-              </w:rPr>
-              <w:t>4 BlazeBlocks</w:t>
-            </w:r>
-          </w:p>
-        </w:tc>
-        <w:tc>
-          <w:tcPr>
-            <w:tcW w:type="dxa" w:w="1728"/>
-          </w:tcPr>
-          <w:p>
-            <w:r>
-              <w:rPr>
-                <w:sz w:val="20"/>
-              </w:rPr>
-              <w:t>46,896</w:t>
-            </w:r>
-          </w:p>
-        </w:tc>
-      </w:tr>
-      <w:tr>
-        <w:tc>
-          <w:tcPr>
-            <w:tcW w:type="dxa" w:w="1728"/>
-          </w:tcPr>
-          <w:p>
-            <w:r>
-              <w:rPr>
-                <w:sz w:val="20"/>
-              </w:rPr>
-              <w:t>stage3</w:t>
-            </w:r>
-          </w:p>
-        </w:tc>
-        <w:tc>
-          <w:tcPr>
-            <w:tcW w:type="dxa" w:w="1728"/>
-          </w:tcPr>
-          <w:p>
-            <w:r>
-              <w:rPr>
-                <w:sz w:val="20"/>
-              </w:rPr>
-              <w:t>96 -&gt; 128</w:t>
-            </w:r>
-          </w:p>
-        </w:tc>
-        <w:tc>
-          <w:tcPr>
-            <w:tcW w:type="dxa" w:w="1728"/>
-          </w:tcPr>
-          <w:p>
-            <w:r>
-              <w:rPr>
-                <w:sz w:val="20"/>
-              </w:rPr>
-              <w:t>24 -&gt; 12</w:t>
-            </w:r>
-          </w:p>
-        </w:tc>
-        <w:tc>
-          <w:tcPr>
-            <w:tcW w:type="dxa" w:w="1728"/>
-          </w:tcPr>
-          <w:p>
-            <w:r>
-              <w:rPr>
-                <w:sz w:val="20"/>
-              </w:rPr>
-              <w:t>4 BlazeBlocks</w:t>
-            </w:r>
-          </w:p>
-        </w:tc>
-        <w:tc>
-          <w:tcPr>
-            <w:tcW w:type="dxa" w:w="1728"/>
-          </w:tcPr>
-          <w:p>
-            <w:r>
-              <w:rPr>
-                <w:sz w:val="20"/>
-              </w:rPr>
-              <w:t>87,968</w:t>
-            </w:r>
-          </w:p>
-        </w:tc>
-      </w:tr>
-      <w:tr>
-        <w:tc>
-          <w:tcPr>
-            <w:tcW w:type="dxa" w:w="1728"/>
-          </w:tcPr>
-          <w:p>
-            <w:r>
-              <w:rPr>
-                <w:sz w:val="20"/>
-              </w:rPr>
-              <w:t>stage4</w:t>
-            </w:r>
-          </w:p>
-        </w:tc>
-        <w:tc>
-          <w:tcPr>
-            <w:tcW w:type="dxa" w:w="1728"/>
-          </w:tcPr>
-          <w:p>
-            <w:r>
-              <w:rPr>
-                <w:sz w:val="20"/>
-              </w:rPr>
-              <w:t>128 -&gt; 192</w:t>
-            </w:r>
-          </w:p>
-        </w:tc>
-        <w:tc>
-          <w:tcPr>
-            <w:tcW w:type="dxa" w:w="1728"/>
-          </w:tcPr>
-          <w:p>
-            <w:r>
-              <w:rPr>
-                <w:sz w:val="20"/>
-              </w:rPr>
-              <w:t>12 -&gt; 6</w:t>
-            </w:r>
-          </w:p>
-        </w:tc>
-        <w:tc>
-          <w:tcPr>
-            <w:tcW w:type="dxa" w:w="1728"/>
-          </w:tcPr>
-          <w:p>
-            <w:r>
-              <w:rPr>
-                <w:sz w:val="20"/>
-              </w:rPr>
-              <w:t>3 BlazeBlocks</w:t>
-            </w:r>
-          </w:p>
-        </w:tc>
-        <w:tc>
-          <w:tcPr>
-            <w:tcW w:type="dxa" w:w="1728"/>
-          </w:tcPr>
-          <w:p>
-            <w:r>
-              <w:rPr>
-                <w:sz w:val="20"/>
-              </w:rPr>
-              <w:t>138,240</w:t>
-            </w:r>
-          </w:p>
-        </w:tc>
-      </w:tr>
-      <w:tr>
-        <w:tc>
-          <w:tcPr>
-            <w:tcW w:type="dxa" w:w="1728"/>
-          </w:tcPr>
-          <w:p>
-            <w:r>
-              <w:rPr>
-                <w:sz w:val="20"/>
-              </w:rPr>
-              <w:t>head</w:t>
-            </w:r>
-          </w:p>
-        </w:tc>
-        <w:tc>
-          <w:tcPr>
-            <w:tcW w:type="dxa" w:w="1728"/>
-          </w:tcPr>
-          <w:p>
-            <w:r>
-              <w:rPr>
-                <w:sz w:val="20"/>
-              </w:rPr>
-              <w:t>192 -&gt; 110</w:t>
-            </w:r>
-          </w:p>
-        </w:tc>
-        <w:tc>
-          <w:tcPr>
-            <w:tcW w:type="dxa" w:w="1728"/>
-          </w:tcPr>
-          <w:p>
-            <w:r>
-              <w:rPr>
-                <w:sz w:val="20"/>
-              </w:rPr>
-              <w:t>GAP + FC + Sigmoid</w:t>
-            </w:r>
-          </w:p>
-        </w:tc>
-        <w:tc>
-          <w:tcPr>
-            <w:tcW w:type="dxa" w:w="1728"/>
-          </w:tcPr>
-          <w:p>
-            <w:r>
-              <w:rPr>
-                <w:sz w:val="20"/>
-              </w:rPr>
-              <w:t>-</w:t>
-            </w:r>
-          </w:p>
-        </w:tc>
-        <w:tc>
-          <w:tcPr>
-            <w:tcW w:type="dxa" w:w="1728"/>
-          </w:tcPr>
-          <w:p>
-            <w:r>
-              <w:rPr>
-                <w:sz w:val="20"/>
-              </w:rPr>
-              <w:t>21,230</w:t>
-            </w:r>
-          </w:p>
-        </w:tc>
-      </w:tr>
-    </w:tbl>
+    <w:p>
+      <w:r>
+        <w:rPr>
+          <w:rFonts w:ascii="Courier New" w:hAnsi="Courier New"/>
+          <w:b/>
+          <w:sz w:val="18"/>
+        </w:rPr>
+        <w:t xml:space="preserve">  Stage   |  Channels    |  Spatial             |  Blocks            |  Parameters</w:t>
+      </w:r>
+      <w:r>
+        <w:rPr>
+          <w:sz w:val="18"/>
+        </w:rPr>
+        <w:br/>
+      </w:r>
+      <w:r>
+        <w:rPr>
+          <w:rFonts w:ascii="Courier New" w:hAnsi="Courier New"/>
+          <w:sz w:val="18"/>
+        </w:rPr>
+        <w:t xml:space="preserve">  --------+--------------+----------------------+--------------------+------------</w:t>
+      </w:r>
+      <w:r>
+        <w:rPr>
+          <w:sz w:val="18"/>
+        </w:rPr>
+        <w:br/>
+      </w:r>
+      <w:r>
+        <w:rPr>
+          <w:rFonts w:ascii="Courier New" w:hAnsi="Courier New"/>
+          <w:sz w:val="18"/>
+        </w:rPr>
+        <w:t xml:space="preserve">  conv0   |  3 -&gt; 24     |  192 -&gt; 96           |  1 (Conv 5x5 s=2)  |  1,848     </w:t>
+      </w:r>
+      <w:r>
+        <w:rPr>
+          <w:sz w:val="18"/>
+        </w:rPr>
+        <w:br/>
+      </w:r>
+      <w:r>
+        <w:rPr>
+          <w:rFonts w:ascii="Courier New" w:hAnsi="Courier New"/>
+          <w:sz w:val="18"/>
+        </w:rPr>
+        <w:t xml:space="preserve">  stage0  |  24 -&gt; 24    |  96 (no downsample)  |  2 BlazeBlocks     |  2,544     </w:t>
+      </w:r>
+      <w:r>
+        <w:rPr>
+          <w:sz w:val="18"/>
+        </w:rPr>
+        <w:br/>
+      </w:r>
+      <w:r>
+        <w:rPr>
+          <w:rFonts w:ascii="Courier New" w:hAnsi="Courier New"/>
+          <w:sz w:val="18"/>
+        </w:rPr>
+        <w:t xml:space="preserve">  stage1  |  24 -&gt; 48    |  96 -&gt; 48            |  4 BlazeBlocks     |  14,232    </w:t>
+      </w:r>
+      <w:r>
+        <w:rPr>
+          <w:sz w:val="18"/>
+        </w:rPr>
+        <w:br/>
+      </w:r>
+      <w:r>
+        <w:rPr>
+          <w:rFonts w:ascii="Courier New" w:hAnsi="Courier New"/>
+          <w:sz w:val="18"/>
+        </w:rPr>
+        <w:t xml:space="preserve">  stage2  |  48 -&gt; 96    |  48 -&gt; 24            |  4 BlazeBlocks     |  46,896    </w:t>
+      </w:r>
+      <w:r>
+        <w:rPr>
+          <w:sz w:val="18"/>
+        </w:rPr>
+        <w:br/>
+      </w:r>
+      <w:r>
+        <w:rPr>
+          <w:rFonts w:ascii="Courier New" w:hAnsi="Courier New"/>
+          <w:sz w:val="18"/>
+        </w:rPr>
+        <w:t xml:space="preserve">  stage3  |  96 -&gt; 128   |  24 -&gt; 12            |  4 BlazeBlocks     |  87,968    </w:t>
+      </w:r>
+      <w:r>
+        <w:rPr>
+          <w:sz w:val="18"/>
+        </w:rPr>
+        <w:br/>
+      </w:r>
+      <w:r>
+        <w:rPr>
+          <w:rFonts w:ascii="Courier New" w:hAnsi="Courier New"/>
+          <w:sz w:val="18"/>
+        </w:rPr>
+        <w:t xml:space="preserve">  stage4  |  128 -&gt; 192  |  12 -&gt; 6             |  3 BlazeBlocks     |  138,240   </w:t>
+      </w:r>
+      <w:r>
+        <w:rPr>
+          <w:sz w:val="18"/>
+        </w:rPr>
+        <w:br/>
+      </w:r>
+      <w:r>
+        <w:rPr>
+          <w:rFonts w:ascii="Courier New" w:hAnsi="Courier New"/>
+          <w:sz w:val="18"/>
+        </w:rPr>
+        <w:t xml:space="preserve">  head    |  192 -&gt; 110  |  GAP + FC + Sigmoid  |  -                 |  21,230    </w:t>
+      </w:r>
+    </w:p>
     <w:p/>
     <w:p>
       <w:r>
@@ -1333,294 +611,81 @@
         <w:t>The 55 landmarks are organized as four linestrips tracing the major anatomical structures of the ear:</w:t>
       </w:r>
     </w:p>
-    <w:tbl>
-      <w:tblPr>
-        <w:tblStyle w:val="TableGrid"/>
-        <w:tblW w:type="auto" w:w="0"/>
-        <w:jc w:val="center"/>
-        <w:tblLook w:firstColumn="1" w:firstRow="1" w:lastColumn="0" w:lastRow="0" w:noHBand="0" w:noVBand="1" w:val="04A0"/>
-      </w:tblPr>
-      <w:tblGrid>
-        <w:gridCol w:w="2160"/>
-        <w:gridCol w:w="2160"/>
-        <w:gridCol w:w="2160"/>
-        <w:gridCol w:w="2160"/>
-      </w:tblGrid>
-      <w:tr>
-        <w:tc>
-          <w:tcPr>
-            <w:tcW w:type="dxa" w:w="2160"/>
-          </w:tcPr>
-          <w:p>
-            <w:r>
-              <w:rPr>
-                <w:b/>
-                <w:sz w:val="20"/>
-              </w:rPr>
-              <w:t>Group</w:t>
-            </w:r>
-          </w:p>
-        </w:tc>
-        <w:tc>
-          <w:tcPr>
-            <w:tcW w:type="dxa" w:w="2160"/>
-          </w:tcPr>
-          <w:p>
-            <w:r>
-              <w:rPr>
-                <w:b/>
-                <w:sz w:val="20"/>
-              </w:rPr>
-              <w:t>Indices</w:t>
-            </w:r>
-          </w:p>
-        </w:tc>
-        <w:tc>
-          <w:tcPr>
-            <w:tcW w:type="dxa" w:w="2160"/>
-          </w:tcPr>
-          <w:p>
-            <w:r>
-              <w:rPr>
-                <w:b/>
-                <w:sz w:val="20"/>
-              </w:rPr>
-              <w:t>Points</w:t>
-            </w:r>
-          </w:p>
-        </w:tc>
-        <w:tc>
-          <w:tcPr>
-            <w:tcW w:type="dxa" w:w="2160"/>
-          </w:tcPr>
-          <w:p>
-            <w:r>
-              <w:rPr>
-                <w:b/>
-                <w:sz w:val="20"/>
-              </w:rPr>
-              <w:t>Anatomical Structure</w:t>
-            </w:r>
-          </w:p>
-        </w:tc>
-      </w:tr>
-      <w:tr>
-        <w:tc>
-          <w:tcPr>
-            <w:tcW w:type="dxa" w:w="2160"/>
-          </w:tcPr>
-          <w:p>
-            <w:r>
-              <w:rPr>
-                <w:sz w:val="20"/>
-              </w:rPr>
-              <w:t>Helix</w:t>
-            </w:r>
-          </w:p>
-        </w:tc>
-        <w:tc>
-          <w:tcPr>
-            <w:tcW w:type="dxa" w:w="2160"/>
-          </w:tcPr>
-          <w:p>
-            <w:r>
-              <w:rPr>
-                <w:sz w:val="20"/>
-              </w:rPr>
-              <w:t>0-19</w:t>
-            </w:r>
-          </w:p>
-        </w:tc>
-        <w:tc>
-          <w:tcPr>
-            <w:tcW w:type="dxa" w:w="2160"/>
-          </w:tcPr>
-          <w:p>
-            <w:r>
-              <w:rPr>
-                <w:sz w:val="20"/>
-              </w:rPr>
-              <w:t>20</w:t>
-            </w:r>
-          </w:p>
-        </w:tc>
-        <w:tc>
-          <w:tcPr>
-            <w:tcW w:type="dxa" w:w="2160"/>
-          </w:tcPr>
-          <w:p>
-            <w:r>
-              <w:rPr>
-                <w:sz w:val="20"/>
-              </w:rPr>
-              <w:t>Outer rim of the ear, from superior to inferior</w:t>
-            </w:r>
-          </w:p>
-        </w:tc>
-      </w:tr>
-      <w:tr>
-        <w:tc>
-          <w:tcPr>
-            <w:tcW w:type="dxa" w:w="2160"/>
-          </w:tcPr>
-          <w:p>
-            <w:r>
-              <w:rPr>
-                <w:sz w:val="20"/>
-              </w:rPr>
-              <w:t>Antihelix</w:t>
-            </w:r>
-          </w:p>
-        </w:tc>
-        <w:tc>
-          <w:tcPr>
-            <w:tcW w:type="dxa" w:w="2160"/>
-          </w:tcPr>
-          <w:p>
-            <w:r>
-              <w:rPr>
-                <w:sz w:val="20"/>
-              </w:rPr>
-              <w:t>20-34</w:t>
-            </w:r>
-          </w:p>
-        </w:tc>
-        <w:tc>
-          <w:tcPr>
-            <w:tcW w:type="dxa" w:w="2160"/>
-          </w:tcPr>
-          <w:p>
-            <w:r>
-              <w:rPr>
-                <w:sz w:val="20"/>
-              </w:rPr>
-              <w:t>15</w:t>
-            </w:r>
-          </w:p>
-        </w:tc>
-        <w:tc>
-          <w:tcPr>
-            <w:tcW w:type="dxa" w:w="2160"/>
-          </w:tcPr>
-          <w:p>
-            <w:r>
-              <w:rPr>
-                <w:sz w:val="20"/>
-              </w:rPr>
-              <w:t>Inner ridge, including superior and inferior crus</w:t>
-            </w:r>
-          </w:p>
-        </w:tc>
-      </w:tr>
-      <w:tr>
-        <w:tc>
-          <w:tcPr>
-            <w:tcW w:type="dxa" w:w="2160"/>
-          </w:tcPr>
-          <w:p>
-            <w:r>
-              <w:rPr>
-                <w:sz w:val="20"/>
-              </w:rPr>
-              <w:t>Concha</w:t>
-            </w:r>
-          </w:p>
-        </w:tc>
-        <w:tc>
-          <w:tcPr>
-            <w:tcW w:type="dxa" w:w="2160"/>
-          </w:tcPr>
-          <w:p>
-            <w:r>
-              <w:rPr>
-                <w:sz w:val="20"/>
-              </w:rPr>
-              <w:t>35-49</w:t>
-            </w:r>
-          </w:p>
-        </w:tc>
-        <w:tc>
-          <w:tcPr>
-            <w:tcW w:type="dxa" w:w="2160"/>
-          </w:tcPr>
-          <w:p>
-            <w:r>
-              <w:rPr>
-                <w:sz w:val="20"/>
-              </w:rPr>
-              <w:t>15</w:t>
-            </w:r>
-          </w:p>
-        </w:tc>
-        <w:tc>
-          <w:tcPr>
-            <w:tcW w:type="dxa" w:w="2160"/>
-          </w:tcPr>
-          <w:p>
-            <w:r>
-              <w:rPr>
-                <w:sz w:val="20"/>
-              </w:rPr>
-              <w:t>Bowl-shaped cavity surrounding the ear canal</w:t>
-            </w:r>
-          </w:p>
-        </w:tc>
-      </w:tr>
-      <w:tr>
-        <w:tc>
-          <w:tcPr>
-            <w:tcW w:type="dxa" w:w="2160"/>
-          </w:tcPr>
-          <w:p>
-            <w:r>
-              <w:rPr>
-                <w:sz w:val="20"/>
-              </w:rPr>
-              <w:t>Tragus</w:t>
-            </w:r>
-          </w:p>
-        </w:tc>
-        <w:tc>
-          <w:tcPr>
-            <w:tcW w:type="dxa" w:w="2160"/>
-          </w:tcPr>
-          <w:p>
-            <w:r>
-              <w:rPr>
-                <w:sz w:val="20"/>
-              </w:rPr>
-              <w:t>50-54</w:t>
-            </w:r>
-          </w:p>
-        </w:tc>
-        <w:tc>
-          <w:tcPr>
-            <w:tcW w:type="dxa" w:w="2160"/>
-          </w:tcPr>
-          <w:p>
-            <w:r>
-              <w:rPr>
-                <w:sz w:val="20"/>
-              </w:rPr>
-              <w:t>5</w:t>
-            </w:r>
-          </w:p>
-        </w:tc>
-        <w:tc>
-          <w:tcPr>
-            <w:tcW w:type="dxa" w:w="2160"/>
-          </w:tcPr>
-          <w:p>
-            <w:r>
-              <w:rPr>
-                <w:sz w:val="20"/>
-              </w:rPr>
-              <w:t>Small cartilage flap anterior to the ear canal</w:t>
-            </w:r>
-          </w:p>
-        </w:tc>
-      </w:tr>
-    </w:tbl>
+    <w:p>
+      <w:r>
+        <w:rPr>
+          <w:rFonts w:ascii="Courier New" w:hAnsi="Courier New"/>
+          <w:b/>
+          <w:sz w:val="18"/>
+        </w:rPr>
+        <w:t xml:space="preserve">  Group      |  Indices  |  Points  |  Anatomical Structure                             </w:t>
+      </w:r>
+      <w:r>
+        <w:rPr>
+          <w:sz w:val="18"/>
+        </w:rPr>
+        <w:br/>
+      </w:r>
+      <w:r>
+        <w:rPr>
+          <w:rFonts w:ascii="Courier New" w:hAnsi="Courier New"/>
+          <w:sz w:val="18"/>
+        </w:rPr>
+        <w:t xml:space="preserve">  -----------+-----------+----------+---------------------------------------------------</w:t>
+      </w:r>
+      <w:r>
+        <w:rPr>
+          <w:sz w:val="18"/>
+        </w:rPr>
+        <w:br/>
+      </w:r>
+      <w:r>
+        <w:rPr>
+          <w:rFonts w:ascii="Courier New" w:hAnsi="Courier New"/>
+          <w:sz w:val="18"/>
+        </w:rPr>
+        <w:t xml:space="preserve">  Helix      |  0-19     |  20      |  Outer rim of the ear, from superior to inferior  </w:t>
+      </w:r>
+      <w:r>
+        <w:rPr>
+          <w:sz w:val="18"/>
+        </w:rPr>
+        <w:br/>
+      </w:r>
+      <w:r>
+        <w:rPr>
+          <w:rFonts w:ascii="Courier New" w:hAnsi="Courier New"/>
+          <w:sz w:val="18"/>
+        </w:rPr>
+        <w:t xml:space="preserve">  Antihelix  |  20-34    |  15      |  Inner ridge, including superior and inferior crus</w:t>
+      </w:r>
+      <w:r>
+        <w:rPr>
+          <w:sz w:val="18"/>
+        </w:rPr>
+        <w:br/>
+      </w:r>
+      <w:r>
+        <w:rPr>
+          <w:rFonts w:ascii="Courier New" w:hAnsi="Courier New"/>
+          <w:sz w:val="18"/>
+        </w:rPr>
+        <w:t xml:space="preserve">  Concha     |  35-49    |  15      |  Bowl-shaped cavity surrounding the ear canal     </w:t>
+      </w:r>
+      <w:r>
+        <w:rPr>
+          <w:sz w:val="18"/>
+        </w:rPr>
+        <w:br/>
+      </w:r>
+      <w:r>
+        <w:rPr>
+          <w:rFonts w:ascii="Courier New" w:hAnsi="Courier New"/>
+          <w:sz w:val="18"/>
+        </w:rPr>
+        <w:t xml:space="preserve">  Tragus     |  50-54    |  5       |  Small cartilage flap anterior to the ear canal   </w:t>
+      </w:r>
+    </w:p>
     <w:p/>
     <w:p>
       <w:r>
@@ -1643,300 +708,146 @@
         <w:t>Training</w:t>
       </w:r>
     </w:p>
-    <w:tbl>
-      <w:tblPr>
-        <w:tblStyle w:val="TableGrid"/>
-        <w:tblW w:type="auto" w:w="0"/>
-        <w:jc w:val="center"/>
-        <w:tblLook w:firstColumn="1" w:firstRow="1" w:lastColumn="0" w:lastRow="0" w:noHBand="0" w:noVBand="1" w:val="04A0"/>
-      </w:tblPr>
-      <w:tblGrid>
-        <w:gridCol w:w="4320"/>
-        <w:gridCol w:w="4320"/>
-      </w:tblGrid>
-      <w:tr>
-        <w:tc>
-          <w:tcPr>
-            <w:tcW w:type="dxa" w:w="4320"/>
-          </w:tcPr>
-          <w:p>
-            <w:r>
-              <w:rPr>
-                <w:b/>
-                <w:sz w:val="20"/>
-              </w:rPr>
-              <w:t>Setting</w:t>
-            </w:r>
-          </w:p>
-        </w:tc>
-        <w:tc>
-          <w:tcPr>
-            <w:tcW w:type="dxa" w:w="4320"/>
-          </w:tcPr>
-          <w:p>
-            <w:r>
-              <w:rPr>
-                <w:b/>
-                <w:sz w:val="20"/>
-              </w:rPr>
-              <w:t>Value</w:t>
-            </w:r>
-          </w:p>
-        </w:tc>
-      </w:tr>
-      <w:tr>
-        <w:tc>
-          <w:tcPr>
-            <w:tcW w:type="dxa" w:w="4320"/>
-          </w:tcPr>
-          <w:p>
-            <w:r>
-              <w:rPr>
-                <w:sz w:val="20"/>
-              </w:rPr>
-              <w:t>Loss function</w:t>
-            </w:r>
-          </w:p>
-        </w:tc>
-        <w:tc>
-          <w:tcPr>
-            <w:tcW w:type="dxa" w:w="4320"/>
-          </w:tcPr>
-          <w:p>
-            <w:r>
-              <w:rPr>
-                <w:sz w:val="20"/>
-              </w:rPr>
-              <w:t>Wing loss (w=0.04, epsilon=0.01)</w:t>
-            </w:r>
-          </w:p>
-        </w:tc>
-      </w:tr>
-      <w:tr>
-        <w:tc>
-          <w:tcPr>
-            <w:tcW w:type="dxa" w:w="4320"/>
-          </w:tcPr>
-          <w:p>
-            <w:r>
-              <w:rPr>
-                <w:sz w:val="20"/>
-              </w:rPr>
-              <w:t>Optimizer</w:t>
-            </w:r>
-          </w:p>
-        </w:tc>
-        <w:tc>
-          <w:tcPr>
-            <w:tcW w:type="dxa" w:w="4320"/>
-          </w:tcPr>
-          <w:p>
-            <w:r>
-              <w:rPr>
-                <w:sz w:val="20"/>
-              </w:rPr>
-              <w:t>AdamW (lr=1e-3, weight decay=1e-4)</w:t>
-            </w:r>
-          </w:p>
-        </w:tc>
-      </w:tr>
-      <w:tr>
-        <w:tc>
-          <w:tcPr>
-            <w:tcW w:type="dxa" w:w="4320"/>
-          </w:tcPr>
-          <w:p>
-            <w:r>
-              <w:rPr>
-                <w:sz w:val="20"/>
-              </w:rPr>
-              <w:t>Learning rate schedule</w:t>
-            </w:r>
-          </w:p>
-        </w:tc>
-        <w:tc>
-          <w:tcPr>
-            <w:tcW w:type="dxa" w:w="4320"/>
-          </w:tcPr>
-          <w:p>
-            <w:r>
-              <w:rPr>
-                <w:sz w:val="20"/>
-              </w:rPr>
-              <w:t>Cosine annealing to 1e-5</w:t>
-            </w:r>
-          </w:p>
-        </w:tc>
-      </w:tr>
-      <w:tr>
-        <w:tc>
-          <w:tcPr>
-            <w:tcW w:type="dxa" w:w="4320"/>
-          </w:tcPr>
-          <w:p>
-            <w:r>
-              <w:rPr>
-                <w:sz w:val="20"/>
-              </w:rPr>
-              <w:t>Precision</w:t>
-            </w:r>
-          </w:p>
-        </w:tc>
-        <w:tc>
-          <w:tcPr>
-            <w:tcW w:type="dxa" w:w="4320"/>
-          </w:tcPr>
-          <w:p>
-            <w:r>
-              <w:rPr>
-                <w:sz w:val="20"/>
-              </w:rPr>
-              <w:t>16-mixed AMP</w:t>
-            </w:r>
-          </w:p>
-        </w:tc>
-      </w:tr>
-      <w:tr>
-        <w:tc>
-          <w:tcPr>
-            <w:tcW w:type="dxa" w:w="4320"/>
-          </w:tcPr>
-          <w:p>
-            <w:r>
-              <w:rPr>
-                <w:sz w:val="20"/>
-              </w:rPr>
-              <w:t>Batch size</w:t>
-            </w:r>
-          </w:p>
-        </w:tc>
-        <w:tc>
-          <w:tcPr>
-            <w:tcW w:type="dxa" w:w="4320"/>
-          </w:tcPr>
-          <w:p>
-            <w:r>
-              <w:rPr>
-                <w:sz w:val="20"/>
-              </w:rPr>
-              <w:t>64</w:t>
-            </w:r>
-          </w:p>
-        </w:tc>
-      </w:tr>
-      <w:tr>
-        <w:tc>
-          <w:tcPr>
-            <w:tcW w:type="dxa" w:w="4320"/>
-          </w:tcPr>
-          <w:p>
-            <w:r>
-              <w:rPr>
-                <w:sz w:val="20"/>
-              </w:rPr>
-              <w:t>Input normalization</w:t>
-            </w:r>
-          </w:p>
-        </w:tc>
-        <w:tc>
-          <w:tcPr>
-            <w:tcW w:type="dxa" w:w="4320"/>
-          </w:tcPr>
-          <w:p>
-            <w:r>
-              <w:rPr>
-                <w:sz w:val="20"/>
-              </w:rPr>
-              <w:t>[-1, 1] (pixel / 255, subtract 0.5, divide 0.5)</w:t>
-            </w:r>
-          </w:p>
-        </w:tc>
-      </w:tr>
-      <w:tr>
-        <w:tc>
-          <w:tcPr>
-            <w:tcW w:type="dxa" w:w="4320"/>
-          </w:tcPr>
-          <w:p>
-            <w:r>
-              <w:rPr>
-                <w:sz w:val="20"/>
-              </w:rPr>
-              <w:t>Augmentation</w:t>
-            </w:r>
-          </w:p>
-        </w:tc>
-        <w:tc>
-          <w:tcPr>
-            <w:tcW w:type="dxa" w:w="4320"/>
-          </w:tcPr>
-          <w:p>
-            <w:r>
-              <w:rPr>
-                <w:sz w:val="20"/>
-              </w:rPr>
-              <w:t>Horizontal flip (50%), translation (5%), rotation (+/-15 deg), color jitter (B=0.3, C=0.3, S=0.2, H=0.05), bbox jitter (10%)</w:t>
-            </w:r>
-          </w:p>
-        </w:tc>
-      </w:tr>
-      <w:tr>
-        <w:tc>
-          <w:tcPr>
-            <w:tcW w:type="dxa" w:w="4320"/>
-          </w:tcPr>
-          <w:p>
-            <w:r>
-              <w:rPr>
-                <w:sz w:val="20"/>
-              </w:rPr>
-              <w:t>Early stopping</w:t>
-            </w:r>
-          </w:p>
-        </w:tc>
-        <w:tc>
-          <w:tcPr>
-            <w:tcW w:type="dxa" w:w="4320"/>
-          </w:tcPr>
-          <w:p>
-            <w:r>
-              <w:rPr>
-                <w:sz w:val="20"/>
-              </w:rPr>
-              <w:t>Patience 50 epochs on val NME</w:t>
-            </w:r>
-          </w:p>
-        </w:tc>
-      </w:tr>
-      <w:tr>
-        <w:tc>
-          <w:tcPr>
-            <w:tcW w:type="dxa" w:w="4320"/>
-          </w:tcPr>
-          <w:p>
-            <w:r>
-              <w:rPr>
-                <w:sz w:val="20"/>
-              </w:rPr>
-              <w:t>Hardware</w:t>
-            </w:r>
-          </w:p>
-        </w:tc>
-        <w:tc>
-          <w:tcPr>
-            <w:tcW w:type="dxa" w:w="4320"/>
-          </w:tcPr>
-          <w:p>
-            <w:r>
-              <w:rPr>
-                <w:sz w:val="20"/>
-              </w:rPr>
-              <w:t>RTX 5060 Ti 16GB, Ryzen 9 9950X3D, 64GB RAM</w:t>
-            </w:r>
-          </w:p>
-        </w:tc>
-      </w:tr>
-    </w:tbl>
+    <w:p>
+      <w:r>
+        <w:rPr>
+          <w:rFonts w:ascii="Courier New" w:hAnsi="Courier New"/>
+          <w:b/>
+          <w:sz w:val="18"/>
+        </w:rPr>
+        <w:t xml:space="preserve">  Setting                 |  Value                                                                                                                       </w:t>
+      </w:r>
+      <w:r>
+        <w:rPr>
+          <w:sz w:val="18"/>
+        </w:rPr>
+        <w:br/>
+      </w:r>
+      <w:r>
+        <w:rPr>
+          <w:rFonts w:ascii="Courier New" w:hAnsi="Courier New"/>
+          <w:sz w:val="18"/>
+        </w:rPr>
+        <w:t xml:space="preserve">  ------------------------+------------------------------------------------------------------------------------------------------------------------------</w:t>
+      </w:r>
+      <w:r>
+        <w:rPr>
+          <w:sz w:val="18"/>
+        </w:rPr>
+        <w:br/>
+      </w:r>
+      <w:r>
+        <w:rPr>
+          <w:rFonts w:ascii="Courier New" w:hAnsi="Courier New"/>
+          <w:sz w:val="18"/>
+        </w:rPr>
+        <w:t xml:space="preserve">  Loss function           |  Wing loss (w=0.04, epsilon=0.01)                                                                                            </w:t>
+      </w:r>
+      <w:r>
+        <w:rPr>
+          <w:sz w:val="18"/>
+        </w:rPr>
+        <w:br/>
+      </w:r>
+      <w:r>
+        <w:rPr>
+          <w:rFonts w:ascii="Courier New" w:hAnsi="Courier New"/>
+          <w:sz w:val="18"/>
+        </w:rPr>
+        <w:t xml:space="preserve">  Optimizer               |  AdamW (lr=1e-3, weight decay=1e-4)                                                                                          </w:t>
+      </w:r>
+      <w:r>
+        <w:rPr>
+          <w:sz w:val="18"/>
+        </w:rPr>
+        <w:br/>
+      </w:r>
+      <w:r>
+        <w:rPr>
+          <w:rFonts w:ascii="Courier New" w:hAnsi="Courier New"/>
+          <w:sz w:val="18"/>
+        </w:rPr>
+        <w:t xml:space="preserve">  Learning rate schedule  |  Cosine annealing to 1e-5                                                                                                    </w:t>
+      </w:r>
+      <w:r>
+        <w:rPr>
+          <w:sz w:val="18"/>
+        </w:rPr>
+        <w:br/>
+      </w:r>
+      <w:r>
+        <w:rPr>
+          <w:rFonts w:ascii="Courier New" w:hAnsi="Courier New"/>
+          <w:sz w:val="18"/>
+        </w:rPr>
+        <w:t xml:space="preserve">  Precision               |  16-mixed AMP                                                                                                                </w:t>
+      </w:r>
+      <w:r>
+        <w:rPr>
+          <w:sz w:val="18"/>
+        </w:rPr>
+        <w:br/>
+      </w:r>
+      <w:r>
+        <w:rPr>
+          <w:rFonts w:ascii="Courier New" w:hAnsi="Courier New"/>
+          <w:sz w:val="18"/>
+        </w:rPr>
+        <w:t xml:space="preserve">  Batch size              |  64                                                                                                                          </w:t>
+      </w:r>
+      <w:r>
+        <w:rPr>
+          <w:sz w:val="18"/>
+        </w:rPr>
+        <w:br/>
+      </w:r>
+      <w:r>
+        <w:rPr>
+          <w:rFonts w:ascii="Courier New" w:hAnsi="Courier New"/>
+          <w:sz w:val="18"/>
+        </w:rPr>
+        <w:t xml:space="preserve">  Input normalization     |  [-1, 1] (pixel / 255, subtract 0.5, divide 0.5)                                                                             </w:t>
+      </w:r>
+      <w:r>
+        <w:rPr>
+          <w:sz w:val="18"/>
+        </w:rPr>
+        <w:br/>
+      </w:r>
+      <w:r>
+        <w:rPr>
+          <w:rFonts w:ascii="Courier New" w:hAnsi="Courier New"/>
+          <w:sz w:val="18"/>
+        </w:rPr>
+        <w:t xml:space="preserve">  Augmentation            |  Horizontal flip (50%), translation (5%), rotation (+/-15 deg), color jitter (B=0.3, C=0.3, S=0.2, H=0.05), bbox jitter (10%)</w:t>
+      </w:r>
+      <w:r>
+        <w:rPr>
+          <w:sz w:val="18"/>
+        </w:rPr>
+        <w:br/>
+      </w:r>
+      <w:r>
+        <w:rPr>
+          <w:rFonts w:ascii="Courier New" w:hAnsi="Courier New"/>
+          <w:sz w:val="18"/>
+        </w:rPr>
+        <w:t xml:space="preserve">  Early stopping          |  Patience 50 epochs on val NME                                                                                               </w:t>
+      </w:r>
+      <w:r>
+        <w:rPr>
+          <w:sz w:val="18"/>
+        </w:rPr>
+        <w:br/>
+      </w:r>
+      <w:r>
+        <w:rPr>
+          <w:rFonts w:ascii="Courier New" w:hAnsi="Courier New"/>
+          <w:sz w:val="18"/>
+        </w:rPr>
+        <w:t xml:space="preserve">  Hardware                |  RTX 5060 Ti 16GB, Ryzen 9 9950X3D, 64GB RAM                                                                                 </w:t>
+      </w:r>
+    </w:p>
     <w:p/>
     <w:p>
       <w:r>
@@ -2009,272 +920,133 @@
         <w:t>Results</w:t>
       </w:r>
     </w:p>
-    <w:tbl>
-      <w:tblPr>
-        <w:tblStyle w:val="TableGrid"/>
-        <w:tblW w:type="auto" w:w="0"/>
-        <w:jc w:val="center"/>
-        <w:tblLook w:firstColumn="1" w:firstRow="1" w:lastColumn="0" w:lastRow="0" w:noHBand="0" w:noVBand="1" w:val="04A0"/>
-      </w:tblPr>
-      <w:tblGrid>
-        <w:gridCol w:w="4320"/>
-        <w:gridCol w:w="4320"/>
-      </w:tblGrid>
-      <w:tr>
-        <w:tc>
-          <w:tcPr>
-            <w:tcW w:type="dxa" w:w="4320"/>
-          </w:tcPr>
-          <w:p>
-            <w:r>
-              <w:rPr>
-                <w:b/>
-                <w:sz w:val="20"/>
-              </w:rPr>
-              <w:t>Metric</w:t>
-            </w:r>
-          </w:p>
-        </w:tc>
-        <w:tc>
-          <w:tcPr>
-            <w:tcW w:type="dxa" w:w="4320"/>
-          </w:tcPr>
-          <w:p>
-            <w:r>
-              <w:rPr>
-                <w:b/>
-                <w:sz w:val="20"/>
-              </w:rPr>
-              <w:t>Value</w:t>
-            </w:r>
-          </w:p>
-        </w:tc>
-      </w:tr>
-      <w:tr>
-        <w:tc>
-          <w:tcPr>
-            <w:tcW w:type="dxa" w:w="4320"/>
-          </w:tcPr>
-          <w:p>
-            <w:r>
-              <w:rPr>
-                <w:sz w:val="20"/>
-              </w:rPr>
-              <w:t>Val NME (normalized mean error)</w:t>
-            </w:r>
-          </w:p>
-        </w:tc>
-        <w:tc>
-          <w:tcPr>
-            <w:tcW w:type="dxa" w:w="4320"/>
-          </w:tcPr>
-          <w:p>
-            <w:r>
-              <w:rPr>
-                <w:sz w:val="20"/>
-              </w:rPr>
-              <w:t>0.0307</w:t>
-            </w:r>
-          </w:p>
-        </w:tc>
-      </w:tr>
-      <w:tr>
-        <w:tc>
-          <w:tcPr>
-            <w:tcW w:type="dxa" w:w="4320"/>
-          </w:tcPr>
-          <w:p>
-            <w:r>
-              <w:rPr>
-                <w:sz w:val="20"/>
-              </w:rPr>
-              <w:t>Approximate pixel error at 192x192</w:t>
-            </w:r>
-          </w:p>
-        </w:tc>
-        <w:tc>
-          <w:tcPr>
-            <w:tcW w:type="dxa" w:w="4320"/>
-          </w:tcPr>
-          <w:p>
-            <w:r>
-              <w:rPr>
-                <w:sz w:val="20"/>
-              </w:rPr>
-              <w:t>5.9 px</w:t>
-            </w:r>
-          </w:p>
-        </w:tc>
-      </w:tr>
-      <w:tr>
-        <w:tc>
-          <w:tcPr>
-            <w:tcW w:type="dxa" w:w="4320"/>
-          </w:tcPr>
-          <w:p>
-            <w:r>
-              <w:rPr>
-                <w:sz w:val="20"/>
-              </w:rPr>
-              <w:t>Train-val NME gap</w:t>
-            </w:r>
-          </w:p>
-        </w:tc>
-        <w:tc>
-          <w:tcPr>
-            <w:tcW w:type="dxa" w:w="4320"/>
-          </w:tcPr>
-          <w:p>
-            <w:r>
-              <w:rPr>
-                <w:sz w:val="20"/>
-              </w:rPr>
-              <w:t>0.0014</w:t>
-            </w:r>
-          </w:p>
-        </w:tc>
-      </w:tr>
-      <w:tr>
-        <w:tc>
-          <w:tcPr>
-            <w:tcW w:type="dxa" w:w="4320"/>
-          </w:tcPr>
-          <w:p>
-            <w:r>
-              <w:rPr>
-                <w:sz w:val="20"/>
-              </w:rPr>
-              <w:t>GPU inference (RTX 5060 Ti)</w:t>
-            </w:r>
-          </w:p>
-        </w:tc>
-        <w:tc>
-          <w:tcPr>
-            <w:tcW w:type="dxa" w:w="4320"/>
-          </w:tcPr>
-          <w:p>
-            <w:r>
-              <w:rPr>
-                <w:sz w:val="20"/>
-              </w:rPr>
-              <w:t>579 FPS</w:t>
-            </w:r>
-          </w:p>
-        </w:tc>
-      </w:tr>
-      <w:tr>
-        <w:tc>
-          <w:tcPr>
-            <w:tcW w:type="dxa" w:w="4320"/>
-          </w:tcPr>
-          <w:p>
-            <w:r>
-              <w:rPr>
-                <w:sz w:val="20"/>
-              </w:rPr>
-              <w:t>CPU inference (Ryzen 9 9950X3D)</w:t>
-            </w:r>
-          </w:p>
-        </w:tc>
-        <w:tc>
-          <w:tcPr>
-            <w:tcW w:type="dxa" w:w="4320"/>
-          </w:tcPr>
-          <w:p>
-            <w:r>
-              <w:rPr>
-                <w:sz w:val="20"/>
-              </w:rPr>
-              <w:t>226 FPS</w:t>
-            </w:r>
-          </w:p>
-        </w:tc>
-      </w:tr>
-      <w:tr>
-        <w:tc>
-          <w:tcPr>
-            <w:tcW w:type="dxa" w:w="4320"/>
-          </w:tcPr>
-          <w:p>
-            <w:r>
-              <w:rPr>
-                <w:sz w:val="20"/>
-              </w:rPr>
-              <w:t>Model parameters</w:t>
-            </w:r>
-          </w:p>
-        </w:tc>
-        <w:tc>
-          <w:tcPr>
-            <w:tcW w:type="dxa" w:w="4320"/>
-          </w:tcPr>
-          <w:p>
-            <w:r>
-              <w:rPr>
-                <w:sz w:val="20"/>
-              </w:rPr>
-              <w:t>312,958</w:t>
-            </w:r>
-          </w:p>
-        </w:tc>
-      </w:tr>
-      <w:tr>
-        <w:tc>
-          <w:tcPr>
-            <w:tcW w:type="dxa" w:w="4320"/>
-          </w:tcPr>
-          <w:p>
-            <w:r>
-              <w:rPr>
-                <w:sz w:val="20"/>
-              </w:rPr>
-              <w:t>Model size (ONNX, simplified)</w:t>
-            </w:r>
-          </w:p>
-        </w:tc>
-        <w:tc>
-          <w:tcPr>
-            <w:tcW w:type="dxa" w:w="4320"/>
-          </w:tcPr>
-          <w:p>
-            <w:r>
-              <w:rPr>
-                <w:sz w:val="20"/>
-              </w:rPr>
-              <w:t>1.2 MB</w:t>
-            </w:r>
-          </w:p>
-        </w:tc>
-      </w:tr>
-      <w:tr>
-        <w:tc>
-          <w:tcPr>
-            <w:tcW w:type="dxa" w:w="4320"/>
-          </w:tcPr>
-          <w:p>
-            <w:r>
-              <w:rPr>
-                <w:sz w:val="20"/>
-              </w:rPr>
-              <w:t>Input resolution</w:t>
-            </w:r>
-          </w:p>
-        </w:tc>
-        <w:tc>
-          <w:tcPr>
-            <w:tcW w:type="dxa" w:w="4320"/>
-          </w:tcPr>
-          <w:p>
-            <w:r>
-              <w:rPr>
-                <w:sz w:val="20"/>
-              </w:rPr>
-              <w:t>192 x 192</w:t>
-            </w:r>
-          </w:p>
-        </w:tc>
-      </w:tr>
-    </w:tbl>
+    <w:p>
+      <w:r>
+        <w:rPr>
+          <w:rFonts w:ascii="Courier New" w:hAnsi="Courier New"/>
+          <w:b/>
+          <w:sz w:val="18"/>
+        </w:rPr>
+        <w:t xml:space="preserve">  Metric                              |  Value    </w:t>
+      </w:r>
+      <w:r>
+        <w:rPr>
+          <w:sz w:val="18"/>
+        </w:rPr>
+        <w:br/>
+      </w:r>
+      <w:r>
+        <w:rPr>
+          <w:rFonts w:ascii="Courier New" w:hAnsi="Courier New"/>
+          <w:sz w:val="18"/>
+        </w:rPr>
+        <w:t xml:space="preserve">  ------------------------------------+-----------</w:t>
+      </w:r>
+      <w:r>
+        <w:rPr>
+          <w:sz w:val="18"/>
+        </w:rPr>
+        <w:br/>
+      </w:r>
+      <w:r>
+        <w:rPr>
+          <w:rFonts w:ascii="Courier New" w:hAnsi="Courier New"/>
+          <w:sz w:val="18"/>
+        </w:rPr>
+        <w:t xml:space="preserve">  Val NME (normalized mean error)     |  0.0307   </w:t>
+      </w:r>
+      <w:r>
+        <w:rPr>
+          <w:sz w:val="18"/>
+        </w:rPr>
+        <w:br/>
+      </w:r>
+      <w:r>
+        <w:rPr>
+          <w:rFonts w:ascii="Courier New" w:hAnsi="Courier New"/>
+          <w:sz w:val="18"/>
+        </w:rPr>
+        <w:t xml:space="preserve">  Approximate pixel error at 192x192  |  5.9 px   </w:t>
+      </w:r>
+      <w:r>
+        <w:rPr>
+          <w:sz w:val="18"/>
+        </w:rPr>
+        <w:br/>
+      </w:r>
+      <w:r>
+        <w:rPr>
+          <w:rFonts w:ascii="Courier New" w:hAnsi="Courier New"/>
+          <w:sz w:val="18"/>
+        </w:rPr>
+        <w:t xml:space="preserve">  Train-val NME gap                   |  0.0014   </w:t>
+      </w:r>
+      <w:r>
+        <w:rPr>
+          <w:sz w:val="18"/>
+        </w:rPr>
+        <w:br/>
+      </w:r>
+      <w:r>
+        <w:rPr>
+          <w:rFonts w:ascii="Courier New" w:hAnsi="Courier New"/>
+          <w:sz w:val="18"/>
+        </w:rPr>
+        <w:t xml:space="preserve">  GPU inference (RTX 5060 Ti)         |  579 FPS  </w:t>
+      </w:r>
+      <w:r>
+        <w:rPr>
+          <w:sz w:val="18"/>
+        </w:rPr>
+        <w:br/>
+      </w:r>
+      <w:r>
+        <w:rPr>
+          <w:rFonts w:ascii="Courier New" w:hAnsi="Courier New"/>
+          <w:sz w:val="18"/>
+        </w:rPr>
+        <w:t xml:space="preserve">  CPU inference (Ryzen 9 9950X3D)     |  226 FPS  </w:t>
+      </w:r>
+      <w:r>
+        <w:rPr>
+          <w:sz w:val="18"/>
+        </w:rPr>
+        <w:br/>
+      </w:r>
+      <w:r>
+        <w:rPr>
+          <w:rFonts w:ascii="Courier New" w:hAnsi="Courier New"/>
+          <w:sz w:val="18"/>
+        </w:rPr>
+        <w:t xml:space="preserve">  Model parameters                    |  312,958  </w:t>
+      </w:r>
+      <w:r>
+        <w:rPr>
+          <w:sz w:val="18"/>
+        </w:rPr>
+        <w:br/>
+      </w:r>
+      <w:r>
+        <w:rPr>
+          <w:rFonts w:ascii="Courier New" w:hAnsi="Courier New"/>
+          <w:sz w:val="18"/>
+        </w:rPr>
+        <w:t xml:space="preserve">  Model size (ONNX, simplified)       |  1.2 MB   </w:t>
+      </w:r>
+      <w:r>
+        <w:rPr>
+          <w:sz w:val="18"/>
+        </w:rPr>
+        <w:br/>
+      </w:r>
+      <w:r>
+        <w:rPr>
+          <w:rFonts w:ascii="Courier New" w:hAnsi="Courier New"/>
+          <w:sz w:val="18"/>
+        </w:rPr>
+        <w:t xml:space="preserve">  Input resolution                    |  192 x 192</w:t>
+      </w:r>
+    </w:p>
     <w:p/>
     <w:p>
       <w:r>

</xml_diff>

<commit_message>
Enhance article generation by rendering tables as PNG images for improved formatting and readability
</commit_message>
<xml_diff>
--- a/Ear_Landmarker_Article.docx
+++ b/Ear_Landmarker_Article.docx
@@ -201,78 +201,42 @@
       </w:r>
     </w:p>
     <w:p>
+      <w:pPr>
+        <w:jc w:val="center"/>
+      </w:pPr>
       <w:r>
-        <w:rPr>
-          <w:rFonts w:ascii="Courier New" w:hAnsi="Courier New"/>
-          <w:b/>
-          <w:sz w:val="18"/>
-        </w:rPr>
-        <w:t xml:space="preserve">  Source        |  Samples  |  Format           |  Resolution  |  Notes                                       </w:t>
-      </w:r>
-      <w:r>
-        <w:rPr>
-          <w:sz w:val="18"/>
-        </w:rPr>
-        <w:br/>
-      </w:r>
-      <w:r>
-        <w:rPr>
-          <w:rFonts w:ascii="Courier New" w:hAnsi="Courier New"/>
-          <w:sz w:val="18"/>
-        </w:rPr>
-        <w:t xml:space="preserve">  --------------+-----------+-------------------+--------------+----------------------------------------------</w:t>
-      </w:r>
-      <w:r>
-        <w:rPr>
-          <w:sz w:val="18"/>
-        </w:rPr>
-        <w:br/>
-      </w:r>
-      <w:r>
-        <w:rPr>
-          <w:rFonts w:ascii="Courier New" w:hAnsi="Courier New"/>
-          <w:sz w:val="18"/>
-        </w:rPr>
-        <w:t xml:space="preserve">  Collection B  |  3,153    |  .pts (55-point)  |  256x256     |  Pre-cropped ear images                      </w:t>
-      </w:r>
-      <w:r>
-        <w:rPr>
-          <w:sz w:val="18"/>
-        </w:rPr>
-        <w:br/>
-      </w:r>
-      <w:r>
-        <w:rPr>
-          <w:rFonts w:ascii="Courier New" w:hAnsi="Courier New"/>
-          <w:sz w:val="18"/>
-        </w:rPr>
-        <w:t xml:space="preserve">  AudioEar2D    |  2,000    |  LabelMe JSON     |  299x299     |  Synthetic ears from FFHQ, StyleGAN-generated</w:t>
-      </w:r>
-      <w:r>
-        <w:rPr>
-          <w:sz w:val="18"/>
-        </w:rPr>
-        <w:br/>
-      </w:r>
-      <w:r>
-        <w:rPr>
-          <w:rFonts w:ascii="Courier New" w:hAnsi="Courier New"/>
-          <w:sz w:val="18"/>
-        </w:rPr>
-        <w:t xml:space="preserve">  Collection A  |  605      |  .pts (55-point)  |  Variable    |  Full-face images, auto-cropped to ear ROI   </w:t>
-      </w:r>
-      <w:r>
-        <w:rPr>
-          <w:sz w:val="18"/>
-        </w:rPr>
-        <w:br/>
-      </w:r>
-      <w:r>
-        <w:rPr>
-          <w:rFonts w:ascii="Courier New" w:hAnsi="Courier New"/>
-          <w:sz w:val="18"/>
-        </w:rPr>
-        <w:t xml:space="preserve">  AudioEar3D    |  112      |  LabelMe JSON     |  187x186     |  3D-scanned ear renders                      </w:t>
+        <w:drawing>
+          <wp:inline xmlns:a="http://schemas.openxmlformats.org/drawingml/2006/main" xmlns:pic="http://schemas.openxmlformats.org/drawingml/2006/picture">
+            <wp:extent cx="5943600" cy="894696"/>
+            <wp:docPr id="1" name="Picture 1"/>
+            <wp:cNvGraphicFramePr>
+              <a:graphicFrameLocks noChangeAspect="1"/>
+            </wp:cNvGraphicFramePr>
+            <a:graphic>
+              <a:graphicData uri="http://schemas.openxmlformats.org/drawingml/2006/picture">
+                <pic:pic>
+                  <pic:nvPicPr>
+                    <pic:cNvPr id="0" name="image.png"/>
+                    <pic:cNvPicPr/>
+                  </pic:nvPicPr>
+                  <pic:blipFill>
+                    <a:blip r:embed="rId13"/>
+                    <a:stretch>
+                      <a:fillRect/>
+                    </a:stretch>
+                  </pic:blipFill>
+                  <pic:spPr>
+                    <a:xfrm>
+                      <a:off x="0" y="0"/>
+                      <a:ext cx="5943600" cy="894696"/>
+                    </a:xfrm>
+                    <a:prstGeom prst="rect"/>
+                  </pic:spPr>
+                </pic:pic>
+              </a:graphicData>
+            </a:graphic>
+          </wp:inline>
+        </w:drawing>
       </w:r>
     </w:p>
     <w:p/>
@@ -382,117 +346,42 @@
       </w:r>
     </w:p>
     <w:p>
+      <w:pPr>
+        <w:jc w:val="center"/>
+      </w:pPr>
       <w:r>
-        <w:rPr>
-          <w:rFonts w:ascii="Courier New" w:hAnsi="Courier New"/>
-          <w:b/>
-          <w:sz w:val="18"/>
-        </w:rPr>
-        <w:t xml:space="preserve">  Stage   |  Channels    |  Spatial             |  Blocks            |  Parameters</w:t>
-      </w:r>
-      <w:r>
-        <w:rPr>
-          <w:sz w:val="18"/>
-        </w:rPr>
-        <w:br/>
-      </w:r>
-      <w:r>
-        <w:rPr>
-          <w:rFonts w:ascii="Courier New" w:hAnsi="Courier New"/>
-          <w:sz w:val="18"/>
-        </w:rPr>
-        <w:t xml:space="preserve">  --------+--------------+----------------------+--------------------+------------</w:t>
-      </w:r>
-      <w:r>
-        <w:rPr>
-          <w:sz w:val="18"/>
-        </w:rPr>
-        <w:br/>
-      </w:r>
-      <w:r>
-        <w:rPr>
-          <w:rFonts w:ascii="Courier New" w:hAnsi="Courier New"/>
-          <w:sz w:val="18"/>
-        </w:rPr>
-        <w:t xml:space="preserve">  conv0   |  3 -&gt; 24     |  192 -&gt; 96           |  1 (Conv 5x5 s=2)  |  1,848     </w:t>
-      </w:r>
-      <w:r>
-        <w:rPr>
-          <w:sz w:val="18"/>
-        </w:rPr>
-        <w:br/>
-      </w:r>
-      <w:r>
-        <w:rPr>
-          <w:rFonts w:ascii="Courier New" w:hAnsi="Courier New"/>
-          <w:sz w:val="18"/>
-        </w:rPr>
-        <w:t xml:space="preserve">  stage0  |  24 -&gt; 24    |  96 (no downsample)  |  2 BlazeBlocks     |  2,544     </w:t>
-      </w:r>
-      <w:r>
-        <w:rPr>
-          <w:sz w:val="18"/>
-        </w:rPr>
-        <w:br/>
-      </w:r>
-      <w:r>
-        <w:rPr>
-          <w:rFonts w:ascii="Courier New" w:hAnsi="Courier New"/>
-          <w:sz w:val="18"/>
-        </w:rPr>
-        <w:t xml:space="preserve">  stage1  |  24 -&gt; 48    |  96 -&gt; 48            |  4 BlazeBlocks     |  14,232    </w:t>
-      </w:r>
-      <w:r>
-        <w:rPr>
-          <w:sz w:val="18"/>
-        </w:rPr>
-        <w:br/>
-      </w:r>
-      <w:r>
-        <w:rPr>
-          <w:rFonts w:ascii="Courier New" w:hAnsi="Courier New"/>
-          <w:sz w:val="18"/>
-        </w:rPr>
-        <w:t xml:space="preserve">  stage2  |  48 -&gt; 96    |  48 -&gt; 24            |  4 BlazeBlocks     |  46,896    </w:t>
-      </w:r>
-      <w:r>
-        <w:rPr>
-          <w:sz w:val="18"/>
-        </w:rPr>
-        <w:br/>
-      </w:r>
-      <w:r>
-        <w:rPr>
-          <w:rFonts w:ascii="Courier New" w:hAnsi="Courier New"/>
-          <w:sz w:val="18"/>
-        </w:rPr>
-        <w:t xml:space="preserve">  stage3  |  96 -&gt; 128   |  24 -&gt; 12            |  4 BlazeBlocks     |  87,968    </w:t>
-      </w:r>
-      <w:r>
-        <w:rPr>
-          <w:sz w:val="18"/>
-        </w:rPr>
-        <w:br/>
-      </w:r>
-      <w:r>
-        <w:rPr>
-          <w:rFonts w:ascii="Courier New" w:hAnsi="Courier New"/>
-          <w:sz w:val="18"/>
-        </w:rPr>
-        <w:t xml:space="preserve">  stage4  |  128 -&gt; 192  |  12 -&gt; 6             |  3 BlazeBlocks     |  138,240   </w:t>
-      </w:r>
-      <w:r>
-        <w:rPr>
-          <w:sz w:val="18"/>
-        </w:rPr>
-        <w:br/>
-      </w:r>
-      <w:r>
-        <w:rPr>
-          <w:rFonts w:ascii="Courier New" w:hAnsi="Courier New"/>
-          <w:sz w:val="18"/>
-        </w:rPr>
-        <w:t xml:space="preserve">  head    |  192 -&gt; 110  |  GAP + FC + Sigmoid  |  -                 |  21,230    </w:t>
+        <w:drawing>
+          <wp:inline xmlns:a="http://schemas.openxmlformats.org/drawingml/2006/main" xmlns:pic="http://schemas.openxmlformats.org/drawingml/2006/picture">
+            <wp:extent cx="5344668" cy="1760220"/>
+            <wp:docPr id="2" name="Picture 2"/>
+            <wp:cNvGraphicFramePr>
+              <a:graphicFrameLocks noChangeAspect="1"/>
+            </wp:cNvGraphicFramePr>
+            <a:graphic>
+              <a:graphicData uri="http://schemas.openxmlformats.org/drawingml/2006/picture">
+                <pic:pic>
+                  <pic:nvPicPr>
+                    <pic:cNvPr id="0" name="image.png"/>
+                    <pic:cNvPicPr/>
+                  </pic:nvPicPr>
+                  <pic:blipFill>
+                    <a:blip r:embed="rId14"/>
+                    <a:stretch>
+                      <a:fillRect/>
+                    </a:stretch>
+                  </pic:blipFill>
+                  <pic:spPr>
+                    <a:xfrm>
+                      <a:off x="0" y="0"/>
+                      <a:ext cx="5344668" cy="1760220"/>
+                    </a:xfrm>
+                    <a:prstGeom prst="rect"/>
+                  </pic:spPr>
+                </pic:pic>
+              </a:graphicData>
+            </a:graphic>
+          </wp:inline>
+        </w:drawing>
       </w:r>
     </w:p>
     <w:p/>
@@ -612,78 +501,42 @@
       </w:r>
     </w:p>
     <w:p>
+      <w:pPr>
+        <w:jc w:val="center"/>
+      </w:pPr>
       <w:r>
-        <w:rPr>
-          <w:rFonts w:ascii="Courier New" w:hAnsi="Courier New"/>
-          <w:b/>
-          <w:sz w:val="18"/>
-        </w:rPr>
-        <w:t xml:space="preserve">  Group      |  Indices  |  Points  |  Anatomical Structure                             </w:t>
-      </w:r>
-      <w:r>
-        <w:rPr>
-          <w:sz w:val="18"/>
-        </w:rPr>
-        <w:br/>
-      </w:r>
-      <w:r>
-        <w:rPr>
-          <w:rFonts w:ascii="Courier New" w:hAnsi="Courier New"/>
-          <w:sz w:val="18"/>
-        </w:rPr>
-        <w:t xml:space="preserve">  -----------+-----------+----------+---------------------------------------------------</w:t>
-      </w:r>
-      <w:r>
-        <w:rPr>
-          <w:sz w:val="18"/>
-        </w:rPr>
-        <w:br/>
-      </w:r>
-      <w:r>
-        <w:rPr>
-          <w:rFonts w:ascii="Courier New" w:hAnsi="Courier New"/>
-          <w:sz w:val="18"/>
-        </w:rPr>
-        <w:t xml:space="preserve">  Helix      |  0-19     |  20      |  Outer rim of the ear, from superior to inferior  </w:t>
-      </w:r>
-      <w:r>
-        <w:rPr>
-          <w:sz w:val="18"/>
-        </w:rPr>
-        <w:br/>
-      </w:r>
-      <w:r>
-        <w:rPr>
-          <w:rFonts w:ascii="Courier New" w:hAnsi="Courier New"/>
-          <w:sz w:val="18"/>
-        </w:rPr>
-        <w:t xml:space="preserve">  Antihelix  |  20-34    |  15      |  Inner ridge, including superior and inferior crus</w:t>
-      </w:r>
-      <w:r>
-        <w:rPr>
-          <w:sz w:val="18"/>
-        </w:rPr>
-        <w:br/>
-      </w:r>
-      <w:r>
-        <w:rPr>
-          <w:rFonts w:ascii="Courier New" w:hAnsi="Courier New"/>
-          <w:sz w:val="18"/>
-        </w:rPr>
-        <w:t xml:space="preserve">  Concha     |  35-49    |  15      |  Bowl-shaped cavity surrounding the ear canal     </w:t>
-      </w:r>
-      <w:r>
-        <w:rPr>
-          <w:sz w:val="18"/>
-        </w:rPr>
-        <w:br/>
-      </w:r>
-      <w:r>
-        <w:rPr>
-          <w:rFonts w:ascii="Courier New" w:hAnsi="Courier New"/>
-          <w:sz w:val="18"/>
-        </w:rPr>
-        <w:t xml:space="preserve">  Tragus     |  50-54    |  5       |  Small cartilage flap anterior to the ear canal   </w:t>
+        <w:drawing>
+          <wp:inline xmlns:a="http://schemas.openxmlformats.org/drawingml/2006/main" xmlns:pic="http://schemas.openxmlformats.org/drawingml/2006/picture">
+            <wp:extent cx="5897880" cy="1101852"/>
+            <wp:docPr id="3" name="Picture 3"/>
+            <wp:cNvGraphicFramePr>
+              <a:graphicFrameLocks noChangeAspect="1"/>
+            </wp:cNvGraphicFramePr>
+            <a:graphic>
+              <a:graphicData uri="http://schemas.openxmlformats.org/drawingml/2006/picture">
+                <pic:pic>
+                  <pic:nvPicPr>
+                    <pic:cNvPr id="0" name="image.png"/>
+                    <pic:cNvPicPr/>
+                  </pic:nvPicPr>
+                  <pic:blipFill>
+                    <a:blip r:embed="rId15"/>
+                    <a:stretch>
+                      <a:fillRect/>
+                    </a:stretch>
+                  </pic:blipFill>
+                  <pic:spPr>
+                    <a:xfrm>
+                      <a:off x="0" y="0"/>
+                      <a:ext cx="5897880" cy="1101852"/>
+                    </a:xfrm>
+                    <a:prstGeom prst="rect"/>
+                  </pic:spPr>
+                </pic:pic>
+              </a:graphicData>
+            </a:graphic>
+          </wp:inline>
+        </w:drawing>
       </w:r>
     </w:p>
     <w:p/>
@@ -709,143 +562,42 @@
       </w:r>
     </w:p>
     <w:p>
+      <w:pPr>
+        <w:jc w:val="center"/>
+      </w:pPr>
       <w:r>
-        <w:rPr>
-          <w:rFonts w:ascii="Courier New" w:hAnsi="Courier New"/>
-          <w:b/>
-          <w:sz w:val="18"/>
-        </w:rPr>
-        <w:t xml:space="preserve">  Setting                 |  Value                                                                                                                       </w:t>
-      </w:r>
-      <w:r>
-        <w:rPr>
-          <w:sz w:val="18"/>
-        </w:rPr>
-        <w:br/>
-      </w:r>
-      <w:r>
-        <w:rPr>
-          <w:rFonts w:ascii="Courier New" w:hAnsi="Courier New"/>
-          <w:sz w:val="18"/>
-        </w:rPr>
-        <w:t xml:space="preserve">  ------------------------+------------------------------------------------------------------------------------------------------------------------------</w:t>
-      </w:r>
-      <w:r>
-        <w:rPr>
-          <w:sz w:val="18"/>
-        </w:rPr>
-        <w:br/>
-      </w:r>
-      <w:r>
-        <w:rPr>
-          <w:rFonts w:ascii="Courier New" w:hAnsi="Courier New"/>
-          <w:sz w:val="18"/>
-        </w:rPr>
-        <w:t xml:space="preserve">  Loss function           |  Wing loss (w=0.04, epsilon=0.01)                                                                                            </w:t>
-      </w:r>
-      <w:r>
-        <w:rPr>
-          <w:sz w:val="18"/>
-        </w:rPr>
-        <w:br/>
-      </w:r>
-      <w:r>
-        <w:rPr>
-          <w:rFonts w:ascii="Courier New" w:hAnsi="Courier New"/>
-          <w:sz w:val="18"/>
-        </w:rPr>
-        <w:t xml:space="preserve">  Optimizer               |  AdamW (lr=1e-3, weight decay=1e-4)                                                                                          </w:t>
-      </w:r>
-      <w:r>
-        <w:rPr>
-          <w:sz w:val="18"/>
-        </w:rPr>
-        <w:br/>
-      </w:r>
-      <w:r>
-        <w:rPr>
-          <w:rFonts w:ascii="Courier New" w:hAnsi="Courier New"/>
-          <w:sz w:val="18"/>
-        </w:rPr>
-        <w:t xml:space="preserve">  Learning rate schedule  |  Cosine annealing to 1e-5                                                                                                    </w:t>
-      </w:r>
-      <w:r>
-        <w:rPr>
-          <w:sz w:val="18"/>
-        </w:rPr>
-        <w:br/>
-      </w:r>
-      <w:r>
-        <w:rPr>
-          <w:rFonts w:ascii="Courier New" w:hAnsi="Courier New"/>
-          <w:sz w:val="18"/>
-        </w:rPr>
-        <w:t xml:space="preserve">  Precision               |  16-mixed AMP                                                                                                                </w:t>
-      </w:r>
-      <w:r>
-        <w:rPr>
-          <w:sz w:val="18"/>
-        </w:rPr>
-        <w:br/>
-      </w:r>
-      <w:r>
-        <w:rPr>
-          <w:rFonts w:ascii="Courier New" w:hAnsi="Courier New"/>
-          <w:sz w:val="18"/>
-        </w:rPr>
-        <w:t xml:space="preserve">  Batch size              |  64                                                                                                                          </w:t>
-      </w:r>
-      <w:r>
-        <w:rPr>
-          <w:sz w:val="18"/>
-        </w:rPr>
-        <w:br/>
-      </w:r>
-      <w:r>
-        <w:rPr>
-          <w:rFonts w:ascii="Courier New" w:hAnsi="Courier New"/>
-          <w:sz w:val="18"/>
-        </w:rPr>
-        <w:t xml:space="preserve">  Input normalization     |  [-1, 1] (pixel / 255, subtract 0.5, divide 0.5)                                                                             </w:t>
-      </w:r>
-      <w:r>
-        <w:rPr>
-          <w:sz w:val="18"/>
-        </w:rPr>
-        <w:br/>
-      </w:r>
-      <w:r>
-        <w:rPr>
-          <w:rFonts w:ascii="Courier New" w:hAnsi="Courier New"/>
-          <w:sz w:val="18"/>
-        </w:rPr>
-        <w:t xml:space="preserve">  Augmentation            |  Horizontal flip (50%), translation (5%), rotation (+/-15 deg), color jitter (B=0.3, C=0.3, S=0.2, H=0.05), bbox jitter (10%)</w:t>
-      </w:r>
-      <w:r>
-        <w:rPr>
-          <w:sz w:val="18"/>
-        </w:rPr>
-        <w:br/>
-      </w:r>
-      <w:r>
-        <w:rPr>
-          <w:rFonts w:ascii="Courier New" w:hAnsi="Courier New"/>
-          <w:sz w:val="18"/>
-        </w:rPr>
-        <w:t xml:space="preserve">  Early stopping          |  Patience 50 epochs on val NME                                                                                               </w:t>
-      </w:r>
-      <w:r>
-        <w:rPr>
-          <w:sz w:val="18"/>
-        </w:rPr>
-        <w:br/>
-      </w:r>
-      <w:r>
-        <w:rPr>
-          <w:rFonts w:ascii="Courier New" w:hAnsi="Courier New"/>
-          <w:sz w:val="18"/>
-        </w:rPr>
-        <w:t xml:space="preserve">  Hardware                |  RTX 5060 Ti 16GB, Ryzen 9 9950X3D, 64GB RAM                                                                                 </w:t>
+        <w:drawing>
+          <wp:inline xmlns:a="http://schemas.openxmlformats.org/drawingml/2006/main" xmlns:pic="http://schemas.openxmlformats.org/drawingml/2006/picture">
+            <wp:extent cx="5943600" cy="1218615"/>
+            <wp:docPr id="4" name="Picture 4"/>
+            <wp:cNvGraphicFramePr>
+              <a:graphicFrameLocks noChangeAspect="1"/>
+            </wp:cNvGraphicFramePr>
+            <a:graphic>
+              <a:graphicData uri="http://schemas.openxmlformats.org/drawingml/2006/picture">
+                <pic:pic>
+                  <pic:nvPicPr>
+                    <pic:cNvPr id="0" name="image.png"/>
+                    <pic:cNvPicPr/>
+                  </pic:nvPicPr>
+                  <pic:blipFill>
+                    <a:blip r:embed="rId16"/>
+                    <a:stretch>
+                      <a:fillRect/>
+                    </a:stretch>
+                  </pic:blipFill>
+                  <pic:spPr>
+                    <a:xfrm>
+                      <a:off x="0" y="0"/>
+                      <a:ext cx="5943600" cy="1218615"/>
+                    </a:xfrm>
+                    <a:prstGeom prst="rect"/>
+                  </pic:spPr>
+                </pic:pic>
+              </a:graphicData>
+            </a:graphic>
+          </wp:inline>
+        </w:drawing>
       </w:r>
     </w:p>
     <w:p/>
@@ -921,130 +673,42 @@
       </w:r>
     </w:p>
     <w:p>
+      <w:pPr>
+        <w:jc w:val="center"/>
+      </w:pPr>
       <w:r>
-        <w:rPr>
-          <w:rFonts w:ascii="Courier New" w:hAnsi="Courier New"/>
-          <w:b/>
-          <w:sz w:val="18"/>
-        </w:rPr>
-        <w:t xml:space="preserve">  Metric                              |  Value    </w:t>
-      </w:r>
-      <w:r>
-        <w:rPr>
-          <w:sz w:val="18"/>
-        </w:rPr>
-        <w:br/>
-      </w:r>
-      <w:r>
-        <w:rPr>
-          <w:rFonts w:ascii="Courier New" w:hAnsi="Courier New"/>
-          <w:sz w:val="18"/>
-        </w:rPr>
-        <w:t xml:space="preserve">  ------------------------------------+-----------</w:t>
-      </w:r>
-      <w:r>
-        <w:rPr>
-          <w:sz w:val="18"/>
-        </w:rPr>
-        <w:br/>
-      </w:r>
-      <w:r>
-        <w:rPr>
-          <w:rFonts w:ascii="Courier New" w:hAnsi="Courier New"/>
-          <w:sz w:val="18"/>
-        </w:rPr>
-        <w:t xml:space="preserve">  Val NME (normalized mean error)     |  0.0307   </w:t>
-      </w:r>
-      <w:r>
-        <w:rPr>
-          <w:sz w:val="18"/>
-        </w:rPr>
-        <w:br/>
-      </w:r>
-      <w:r>
-        <w:rPr>
-          <w:rFonts w:ascii="Courier New" w:hAnsi="Courier New"/>
-          <w:sz w:val="18"/>
-        </w:rPr>
-        <w:t xml:space="preserve">  Approximate pixel error at 192x192  |  5.9 px   </w:t>
-      </w:r>
-      <w:r>
-        <w:rPr>
-          <w:sz w:val="18"/>
-        </w:rPr>
-        <w:br/>
-      </w:r>
-      <w:r>
-        <w:rPr>
-          <w:rFonts w:ascii="Courier New" w:hAnsi="Courier New"/>
-          <w:sz w:val="18"/>
-        </w:rPr>
-        <w:t xml:space="preserve">  Train-val NME gap                   |  0.0014   </w:t>
-      </w:r>
-      <w:r>
-        <w:rPr>
-          <w:sz w:val="18"/>
-        </w:rPr>
-        <w:br/>
-      </w:r>
-      <w:r>
-        <w:rPr>
-          <w:rFonts w:ascii="Courier New" w:hAnsi="Courier New"/>
-          <w:sz w:val="18"/>
-        </w:rPr>
-        <w:t xml:space="preserve">  GPU inference (RTX 5060 Ti)         |  579 FPS  </w:t>
-      </w:r>
-      <w:r>
-        <w:rPr>
-          <w:sz w:val="18"/>
-        </w:rPr>
-        <w:br/>
-      </w:r>
-      <w:r>
-        <w:rPr>
-          <w:rFonts w:ascii="Courier New" w:hAnsi="Courier New"/>
-          <w:sz w:val="18"/>
-        </w:rPr>
-        <w:t xml:space="preserve">  CPU inference (Ryzen 9 9950X3D)     |  226 FPS  </w:t>
-      </w:r>
-      <w:r>
-        <w:rPr>
-          <w:sz w:val="18"/>
-        </w:rPr>
-        <w:br/>
-      </w:r>
-      <w:r>
-        <w:rPr>
-          <w:rFonts w:ascii="Courier New" w:hAnsi="Courier New"/>
-          <w:sz w:val="18"/>
-        </w:rPr>
-        <w:t xml:space="preserve">  Model parameters                    |  312,958  </w:t>
-      </w:r>
-      <w:r>
-        <w:rPr>
-          <w:sz w:val="18"/>
-        </w:rPr>
-        <w:br/>
-      </w:r>
-      <w:r>
-        <w:rPr>
-          <w:rFonts w:ascii="Courier New" w:hAnsi="Courier New"/>
-          <w:sz w:val="18"/>
-        </w:rPr>
-        <w:t xml:space="preserve">  Model size (ONNX, simplified)       |  1.2 MB   </w:t>
-      </w:r>
-      <w:r>
-        <w:rPr>
-          <w:sz w:val="18"/>
-        </w:rPr>
-        <w:br/>
-      </w:r>
-      <w:r>
-        <w:rPr>
-          <w:rFonts w:ascii="Courier New" w:hAnsi="Courier New"/>
-          <w:sz w:val="18"/>
-        </w:rPr>
-        <w:t xml:space="preserve">  Input resolution                    |  192 x 192</w:t>
+        <w:drawing>
+          <wp:inline xmlns:a="http://schemas.openxmlformats.org/drawingml/2006/main" xmlns:pic="http://schemas.openxmlformats.org/drawingml/2006/picture">
+            <wp:extent cx="3479292" cy="1979676"/>
+            <wp:docPr id="5" name="Picture 5"/>
+            <wp:cNvGraphicFramePr>
+              <a:graphicFrameLocks noChangeAspect="1"/>
+            </wp:cNvGraphicFramePr>
+            <a:graphic>
+              <a:graphicData uri="http://schemas.openxmlformats.org/drawingml/2006/picture">
+                <pic:pic>
+                  <pic:nvPicPr>
+                    <pic:cNvPr id="0" name="image.png"/>
+                    <pic:cNvPicPr/>
+                  </pic:nvPicPr>
+                  <pic:blipFill>
+                    <a:blip r:embed="rId17"/>
+                    <a:stretch>
+                      <a:fillRect/>
+                    </a:stretch>
+                  </pic:blipFill>
+                  <pic:spPr>
+                    <a:xfrm>
+                      <a:off x="0" y="0"/>
+                      <a:ext cx="3479292" cy="1979676"/>
+                    </a:xfrm>
+                    <a:prstGeom prst="rect"/>
+                  </pic:spPr>
+                </pic:pic>
+              </a:graphicData>
+            </a:graphic>
+          </wp:inline>
+        </w:drawing>
       </w:r>
     </w:p>
     <w:p/>
@@ -1381,7 +1045,7 @@
         </w:rPr>
         <w:t xml:space="preserve">In a previous project, </w:t>
       </w:r>
-      <w:hyperlink r:id="rId13">
+      <w:hyperlink r:id="rId18">
         <w:r>
           <w:rPr>
             <w:color w:val="0563C1"/>
@@ -1565,7 +1229,7 @@
         </w:rPr>
         <w:t xml:space="preserve">3. </w:t>
       </w:r>
-      <w:hyperlink r:id="rId13">
+      <w:hyperlink r:id="rId18">
         <w:r>
           <w:rPr>
             <w:color w:val="0563C1"/>

</xml_diff>